<commit_message>
fix(portafolio): apunta los botones de CV al Word
La descarga usa ahora CV - RFPG.docx en nav, hero y contacto, y se publica la version actualizada del documento.
</commit_message>
<xml_diff>
--- a/CV/CV - RFPG.docx
+++ b/CV/CV - RFPG.docx
@@ -18,8 +18,8 @@
           <w:b/>
           <w:bCs/>
           <w:color w:val="1F4E79"/>
-          <w:sz w:val="38"/>
-          <w:szCs w:val="38"/>
+          <w:sz w:val="40"/>
+          <w:szCs w:val="40"/>
           <w:lang w:val="es-ES"/>
         </w:rPr>
         <w:t>PEDRO GIOVANNI RICRA FIGUEROA</w:t>
@@ -32,18 +32,18 @@
         <w:rPr>
           <w:i/>
           <w:iCs/>
-          <w:sz w:val="21"/>
-          <w:szCs w:val="21"/>
-          <w:lang w:val="es-ES"/>
-        </w:rPr>
-      </w:pPr>
-      <w:r>
-        <w:rPr>
-          <w:rFonts w:ascii="Calibri" w:eastAsia="Calibri" w:hAnsi="Calibri" w:cs="Calibri"/>
-          <w:i/>
-          <w:iCs/>
-          <w:sz w:val="21"/>
-          <w:szCs w:val="21"/>
+          <w:sz w:val="22"/>
+          <w:szCs w:val="22"/>
+          <w:lang w:val="es-ES"/>
+        </w:rPr>
+      </w:pPr>
+      <w:r>
+        <w:rPr>
+          <w:rFonts w:ascii="Calibri" w:eastAsia="Calibri" w:hAnsi="Calibri" w:cs="Calibri"/>
+          <w:i/>
+          <w:iCs/>
+          <w:sz w:val="22"/>
+          <w:szCs w:val="22"/>
           <w:lang w:val="es-ES"/>
         </w:rPr>
         <w:t>Estudiante de Ingeniería de Sistemas | Desarrollo de Software</w:t>
@@ -66,74 +66,115 @@
       <w:r>
         <w:rPr>
           <w:rFonts w:ascii="Calibri" w:eastAsia="Calibri" w:hAnsi="Calibri" w:cs="Calibri"/>
-          <w:sz w:val="21"/>
-          <w:szCs w:val="21"/>
-          <w:lang w:val="es-ES"/>
-        </w:rPr>
-        <w:t xml:space="preserve">+51 922 149 396 |  </w:t>
+          <w:sz w:val="22"/>
+          <w:szCs w:val="22"/>
+          <w:lang w:val="es-ES"/>
+        </w:rPr>
+        <w:t>+51 922 149 396</w:t>
+      </w:r>
+      <w:r>
+        <w:rPr>
+          <w:rFonts w:ascii="Calibri" w:eastAsia="Calibri" w:hAnsi="Calibri" w:cs="Calibri"/>
+          <w:sz w:val="22"/>
+          <w:szCs w:val="22"/>
+          <w:lang w:val="es-ES"/>
+        </w:rPr>
+        <w:t xml:space="preserve"> </w:t>
+      </w:r>
+      <w:r>
+        <w:rPr>
+          <w:rFonts w:ascii="Calibri" w:eastAsia="Calibri" w:hAnsi="Calibri" w:cs="Calibri"/>
+          <w:sz w:val="22"/>
+          <w:szCs w:val="22"/>
+          <w:lang w:val="es-ES"/>
+        </w:rPr>
+        <w:t xml:space="preserve">| </w:t>
+      </w:r>
+      <w:r>
+        <w:rPr>
+          <w:rFonts w:ascii="Calibri" w:eastAsia="Calibri" w:hAnsi="Calibri" w:cs="Calibri"/>
+          <w:color w:val="156082" w:themeColor="accent1"/>
+          <w:sz w:val="22"/>
+          <w:szCs w:val="22"/>
+          <w:lang w:val="es-ES"/>
+        </w:rPr>
+        <w:t xml:space="preserve">pedro.ricra.figueroa@gmail.com </w:t>
+      </w:r>
+      <w:r>
+        <w:rPr>
+          <w:rFonts w:ascii="Calibri" w:eastAsia="Calibri" w:hAnsi="Calibri" w:cs="Calibri"/>
+          <w:sz w:val="22"/>
+          <w:szCs w:val="22"/>
+          <w:lang w:val="es-ES"/>
+        </w:rPr>
+        <w:t xml:space="preserve">| Pucallpa, Perú | </w:t>
       </w:r>
       <w:hyperlink r:id="rId5" w:history="1">
+        <w:proofErr w:type="spellStart"/>
         <w:r>
           <w:rPr>
             <w:rStyle w:val="Hipervnculo"/>
             <w:rFonts w:ascii="Calibri" w:eastAsia="Calibri" w:hAnsi="Calibri" w:cs="Calibri"/>
-            <w:sz w:val="21"/>
-            <w:szCs w:val="21"/>
+            <w:sz w:val="22"/>
+            <w:szCs w:val="22"/>
             <w:lang w:val="es-ES"/>
           </w:rPr>
-          <w:t>pedro.ricra.figueroa@gmail.com</w:t>
+          <w:t>Github</w:t>
         </w:r>
+        <w:proofErr w:type="spellEnd"/>
       </w:hyperlink>
       <w:r>
         <w:rPr>
-          <w:rFonts w:ascii="Calibri" w:eastAsia="Calibri" w:hAnsi="Calibri" w:cs="Calibri"/>
-          <w:color w:val="595959"/>
-          <w:sz w:val="21"/>
-          <w:szCs w:val="21"/>
-          <w:lang w:val="es-ES"/>
-        </w:rPr>
-        <w:t xml:space="preserve">  </w:t>
-      </w:r>
-      <w:r>
-        <w:rPr>
-          <w:rFonts w:ascii="Calibri" w:eastAsia="Calibri" w:hAnsi="Calibri" w:cs="Calibri"/>
-          <w:sz w:val="21"/>
-          <w:szCs w:val="21"/>
-          <w:lang w:val="es-ES"/>
-        </w:rPr>
-        <w:t xml:space="preserve">|  Pucallpa, Perú |  </w:t>
+          <w:rFonts w:ascii="Calibri" w:hAnsi="Calibri" w:cs="Calibri"/>
+          <w:sz w:val="22"/>
+          <w:szCs w:val="22"/>
+          <w:lang w:val="es-ES"/>
+        </w:rPr>
+        <w:t xml:space="preserve"> | </w:t>
       </w:r>
       <w:hyperlink r:id="rId6" w:history="1">
+        <w:proofErr w:type="spellStart"/>
+        <w:r>
+          <w:rPr>
+            <w:rStyle w:val="Hipervnculo"/>
+            <w:rFonts w:ascii="Calibri" w:hAnsi="Calibri" w:cs="Calibri"/>
+            <w:sz w:val="22"/>
+            <w:szCs w:val="22"/>
+            <w:lang w:val="es-ES"/>
+          </w:rPr>
+          <w:t>Linkedin</w:t>
+        </w:r>
+        <w:proofErr w:type="spellEnd"/>
+      </w:hyperlink>
+      <w:r>
+        <w:rPr>
+          <w:rFonts w:ascii="Calibri" w:eastAsia="Calibri" w:hAnsi="Calibri" w:cs="Calibri"/>
+          <w:color w:val="156082" w:themeColor="accent1"/>
+          <w:sz w:val="22"/>
+          <w:szCs w:val="22"/>
+          <w:lang w:val="es-ES"/>
+        </w:rPr>
+        <w:t xml:space="preserve"> </w:t>
+      </w:r>
+      <w:r>
+        <w:rPr>
+          <w:rFonts w:ascii="Calibri" w:eastAsia="Calibri" w:hAnsi="Calibri" w:cs="Calibri"/>
+          <w:sz w:val="22"/>
+          <w:szCs w:val="22"/>
+          <w:lang w:val="es-ES"/>
+        </w:rPr>
+        <w:t xml:space="preserve">| </w:t>
+      </w:r>
+      <w:hyperlink r:id="rId7" w:history="1">
         <w:r>
           <w:rPr>
             <w:rStyle w:val="Hipervnculo"/>
             <w:rFonts w:ascii="Calibri" w:eastAsia="Calibri" w:hAnsi="Calibri" w:cs="Calibri"/>
-            <w:sz w:val="21"/>
-            <w:szCs w:val="21"/>
+            <w:sz w:val="22"/>
+            <w:szCs w:val="22"/>
             <w:lang w:val="es-ES"/>
           </w:rPr>
-          <w:t>Github</w:t>
-        </w:r>
-      </w:hyperlink>
-      <w:r>
-        <w:rPr>
-          <w:rFonts w:ascii="Calibri" w:hAnsi="Calibri" w:cs="Calibri"/>
-          <w:sz w:val="21"/>
-          <w:szCs w:val="21"/>
-          <w:lang w:val="es-ES"/>
-        </w:rPr>
-        <w:t xml:space="preserve">  |  </w:t>
-      </w:r>
-      <w:hyperlink r:id="rId7" w:history="1">
-        <w:r>
-          <w:rPr>
-            <w:rStyle w:val="Hipervnculo"/>
-            <w:rFonts w:ascii="Calibri" w:hAnsi="Calibri" w:cs="Calibri"/>
-            <w:sz w:val="21"/>
-            <w:szCs w:val="21"/>
-            <w:lang w:val="es-ES"/>
-          </w:rPr>
-          <w:t>Linkedin</w:t>
+          <w:t>Portafolio</w:t>
         </w:r>
       </w:hyperlink>
     </w:p>
@@ -178,7 +219,67 @@
           <w:iCs/>
           <w:lang w:val="es-ES"/>
         </w:rPr>
-        <w:t>Estudiante de Ingeniería de Sistemas (X ciclo) con experiencia práctica en desarrollo de software y testing. He participado en el desarrollo y mejora de interfaces web, integración frontend–backend, diseño de bases de datos y automatización de pruebas. Experiencia trabajando con HTML, CSS, JavaScript, Angular, Node.js y MySQL, así como en equipos bajo metodología Scrum.</w:t>
+        <w:t xml:space="preserve">Estudiante de Ingeniería de Sistemas (X ciclo) con experiencia práctica en desarrollo de software y </w:t>
+      </w:r>
+      <w:proofErr w:type="spellStart"/>
+      <w:r>
+        <w:rPr>
+          <w:rFonts w:ascii="Calibri" w:eastAsia="Calibri" w:hAnsi="Calibri" w:cs="Calibri"/>
+          <w:i/>
+          <w:iCs/>
+          <w:lang w:val="es-ES"/>
+        </w:rPr>
+        <w:t>testing</w:t>
+      </w:r>
+      <w:proofErr w:type="spellEnd"/>
+      <w:r>
+        <w:rPr>
+          <w:rFonts w:ascii="Calibri" w:eastAsia="Calibri" w:hAnsi="Calibri" w:cs="Calibri"/>
+          <w:i/>
+          <w:iCs/>
+          <w:lang w:val="es-ES"/>
+        </w:rPr>
+        <w:t xml:space="preserve">. He participado en el desarrollo y mejora de interfaces web, integración </w:t>
+      </w:r>
+      <w:proofErr w:type="spellStart"/>
+      <w:r>
+        <w:rPr>
+          <w:rFonts w:ascii="Calibri" w:eastAsia="Calibri" w:hAnsi="Calibri" w:cs="Calibri"/>
+          <w:i/>
+          <w:iCs/>
+          <w:lang w:val="es-ES"/>
+        </w:rPr>
+        <w:t>frontend</w:t>
+      </w:r>
+      <w:proofErr w:type="spellEnd"/>
+      <w:r>
+        <w:rPr>
+          <w:rFonts w:ascii="Calibri" w:eastAsia="Calibri" w:hAnsi="Calibri" w:cs="Calibri"/>
+          <w:i/>
+          <w:iCs/>
+          <w:lang w:val="es-ES"/>
+        </w:rPr>
+        <w:t>–</w:t>
+      </w:r>
+      <w:proofErr w:type="spellStart"/>
+      <w:r>
+        <w:rPr>
+          <w:rFonts w:ascii="Calibri" w:eastAsia="Calibri" w:hAnsi="Calibri" w:cs="Calibri"/>
+          <w:i/>
+          <w:iCs/>
+          <w:lang w:val="es-ES"/>
+        </w:rPr>
+        <w:t>backend</w:t>
+      </w:r>
+      <w:proofErr w:type="spellEnd"/>
+      <w:r>
+        <w:rPr>
+          <w:rFonts w:ascii="Calibri" w:eastAsia="Calibri" w:hAnsi="Calibri" w:cs="Calibri"/>
+          <w:i/>
+          <w:iCs/>
+          <w:lang w:val="es-ES"/>
+        </w:rPr>
+        <w:t>, diseño de bases de datos y automatización de pruebas. Experiencia trabajando con HTML, CSS, JavaScript, Angular, Node.js y MySQL, así como en equipos.</w:t>
       </w:r>
     </w:p>
     <w:p>
@@ -252,7 +353,27 @@
           <w:iCs/>
           <w:lang w:val="es-ES"/>
         </w:rPr>
-        <w:t xml:space="preserve"> TypeScript, JavaScript, SQL.</w:t>
+        <w:t xml:space="preserve"> </w:t>
+      </w:r>
+      <w:proofErr w:type="spellStart"/>
+      <w:r>
+        <w:rPr>
+          <w:rFonts w:ascii="Calibri" w:hAnsi="Calibri" w:cs="Calibri"/>
+          <w:i/>
+          <w:iCs/>
+          <w:lang w:val="es-ES"/>
+        </w:rPr>
+        <w:t>TypeScript</w:t>
+      </w:r>
+      <w:proofErr w:type="spellEnd"/>
+      <w:r>
+        <w:rPr>
+          <w:rFonts w:ascii="Calibri" w:hAnsi="Calibri" w:cs="Calibri"/>
+          <w:i/>
+          <w:iCs/>
+          <w:lang w:val="es-ES"/>
+        </w:rPr>
+        <w:t>, JavaScript, SQL.</w:t>
       </w:r>
     </w:p>
     <w:p>
@@ -275,16 +396,80 @@
           <w:iCs/>
           <w:lang w:val="es-ES"/>
         </w:rPr>
-        <w:t>Desarrollo Frontend &amp; Diseño UI:</w:t>
-      </w:r>
-      <w:r>
-        <w:rPr>
-          <w:rFonts w:ascii="Calibri" w:hAnsi="Calibri" w:cs="Calibri"/>
-          <w:i/>
-          <w:iCs/>
-          <w:lang w:val="es-ES"/>
-        </w:rPr>
-        <w:t xml:space="preserve"> Angular, HTML, CSS, Figma, Balsamiq Wireframes.</w:t>
+        <w:t xml:space="preserve">Desarrollo </w:t>
+      </w:r>
+      <w:proofErr w:type="spellStart"/>
+      <w:r>
+        <w:rPr>
+          <w:rFonts w:ascii="Calibri" w:hAnsi="Calibri" w:cs="Calibri"/>
+          <w:b/>
+          <w:bCs/>
+          <w:i/>
+          <w:iCs/>
+          <w:lang w:val="es-ES"/>
+        </w:rPr>
+        <w:t>Frontend</w:t>
+      </w:r>
+      <w:proofErr w:type="spellEnd"/>
+      <w:r>
+        <w:rPr>
+          <w:rFonts w:ascii="Calibri" w:hAnsi="Calibri" w:cs="Calibri"/>
+          <w:b/>
+          <w:bCs/>
+          <w:i/>
+          <w:iCs/>
+          <w:lang w:val="es-ES"/>
+        </w:rPr>
+        <w:t xml:space="preserve"> &amp; Diseño UI:</w:t>
+      </w:r>
+      <w:r>
+        <w:rPr>
+          <w:rFonts w:ascii="Calibri" w:hAnsi="Calibri" w:cs="Calibri"/>
+          <w:i/>
+          <w:iCs/>
+          <w:lang w:val="es-ES"/>
+        </w:rPr>
+        <w:t xml:space="preserve"> Angular, HTML, CSS, </w:t>
+      </w:r>
+      <w:proofErr w:type="spellStart"/>
+      <w:r>
+        <w:rPr>
+          <w:rFonts w:ascii="Calibri" w:hAnsi="Calibri" w:cs="Calibri"/>
+          <w:i/>
+          <w:iCs/>
+          <w:lang w:val="es-ES"/>
+        </w:rPr>
+        <w:t>Figma</w:t>
+      </w:r>
+      <w:proofErr w:type="spellEnd"/>
+      <w:r>
+        <w:rPr>
+          <w:rFonts w:ascii="Calibri" w:hAnsi="Calibri" w:cs="Calibri"/>
+          <w:i/>
+          <w:iCs/>
+          <w:lang w:val="es-ES"/>
+        </w:rPr>
+        <w:t xml:space="preserve">, Balsamiq </w:t>
+      </w:r>
+      <w:proofErr w:type="spellStart"/>
+      <w:r>
+        <w:rPr>
+          <w:rFonts w:ascii="Calibri" w:hAnsi="Calibri" w:cs="Calibri"/>
+          <w:i/>
+          <w:iCs/>
+          <w:lang w:val="es-ES"/>
+        </w:rPr>
+        <w:t>Wireframes</w:t>
+      </w:r>
+      <w:proofErr w:type="spellEnd"/>
+      <w:r>
+        <w:rPr>
+          <w:rFonts w:ascii="Calibri" w:hAnsi="Calibri" w:cs="Calibri"/>
+          <w:i/>
+          <w:iCs/>
+          <w:lang w:val="es-ES"/>
+        </w:rPr>
+        <w:t>.</w:t>
       </w:r>
     </w:p>
     <w:p>
@@ -313,7 +498,25 @@
           <w:i/>
           <w:iCs/>
         </w:rPr>
-        <w:t xml:space="preserve"> Node.js, Spring Boot, Postman, Swagger UI, Arquitectura REST.</w:t>
+        <w:t xml:space="preserve"> Node.js, Spring Boot, Postman, Swagger UI, </w:t>
+      </w:r>
+      <w:proofErr w:type="spellStart"/>
+      <w:r>
+        <w:rPr>
+          <w:rFonts w:ascii="Calibri" w:hAnsi="Calibri" w:cs="Calibri"/>
+          <w:i/>
+          <w:iCs/>
+        </w:rPr>
+        <w:t>Arquitectura</w:t>
+      </w:r>
+      <w:proofErr w:type="spellEnd"/>
+      <w:r>
+        <w:rPr>
+          <w:rFonts w:ascii="Calibri" w:hAnsi="Calibri" w:cs="Calibri"/>
+          <w:i/>
+          <w:iCs/>
+        </w:rPr>
+        <w:t xml:space="preserve"> REST.</w:t>
       </w:r>
     </w:p>
     <w:p>
@@ -368,25 +571,58 @@
           <w:lang w:val="es-ES"/>
         </w:rPr>
       </w:pPr>
-      <w:r>
-        <w:rPr>
-          <w:rFonts w:ascii="Calibri" w:hAnsi="Calibri" w:cs="Calibri"/>
-          <w:b/>
-          <w:bCs/>
-          <w:i/>
-          <w:iCs/>
-          <w:lang w:val="es-ES"/>
-        </w:rPr>
-        <w:t>Testing &amp; Automatización:</w:t>
-      </w:r>
-      <w:r>
-        <w:rPr>
-          <w:rFonts w:ascii="Calibri" w:hAnsi="Calibri" w:cs="Calibri"/>
-          <w:i/>
-          <w:iCs/>
-          <w:lang w:val="es-ES"/>
-        </w:rPr>
-        <w:t xml:space="preserve"> Selenium IDE, Pruebas funcionales.</w:t>
+      <w:proofErr w:type="spellStart"/>
+      <w:r>
+        <w:rPr>
+          <w:rFonts w:ascii="Calibri" w:hAnsi="Calibri" w:cs="Calibri"/>
+          <w:b/>
+          <w:bCs/>
+          <w:i/>
+          <w:iCs/>
+          <w:lang w:val="es-ES"/>
+        </w:rPr>
+        <w:t>Testing</w:t>
+      </w:r>
+      <w:proofErr w:type="spellEnd"/>
+      <w:r>
+        <w:rPr>
+          <w:rFonts w:ascii="Calibri" w:hAnsi="Calibri" w:cs="Calibri"/>
+          <w:b/>
+          <w:bCs/>
+          <w:i/>
+          <w:iCs/>
+          <w:lang w:val="es-ES"/>
+        </w:rPr>
+        <w:t xml:space="preserve"> &amp; Automatización:</w:t>
+      </w:r>
+      <w:r>
+        <w:rPr>
+          <w:rFonts w:ascii="Calibri" w:hAnsi="Calibri" w:cs="Calibri"/>
+          <w:i/>
+          <w:iCs/>
+          <w:lang w:val="es-ES"/>
+        </w:rPr>
+        <w:t xml:space="preserve"> </w:t>
+      </w:r>
+      <w:proofErr w:type="spellStart"/>
+      <w:r>
+        <w:rPr>
+          <w:rFonts w:ascii="Calibri" w:hAnsi="Calibri" w:cs="Calibri"/>
+          <w:i/>
+          <w:iCs/>
+          <w:lang w:val="es-ES"/>
+        </w:rPr>
+        <w:t>Selenium</w:t>
+      </w:r>
+      <w:proofErr w:type="spellEnd"/>
+      <w:r>
+        <w:rPr>
+          <w:rFonts w:ascii="Calibri" w:hAnsi="Calibri" w:cs="Calibri"/>
+          <w:i/>
+          <w:iCs/>
+          <w:lang w:val="es-ES"/>
+        </w:rPr>
+        <w:t xml:space="preserve"> IDE, Pruebas funcionales.</w:t>
       </w:r>
     </w:p>
     <w:p>
@@ -427,7 +663,27 @@
           <w:iCs/>
           <w:lang w:val="es-ES"/>
         </w:rPr>
-        <w:t>Docker, Docker Compose, Git, GitHub</w:t>
+        <w:t xml:space="preserve">Docker, Docker </w:t>
+      </w:r>
+      <w:proofErr w:type="spellStart"/>
+      <w:r>
+        <w:rPr>
+          <w:rFonts w:ascii="Calibri" w:hAnsi="Calibri" w:cs="Calibri"/>
+          <w:i/>
+          <w:iCs/>
+          <w:lang w:val="es-ES"/>
+        </w:rPr>
+        <w:t>Compose</w:t>
+      </w:r>
+      <w:proofErr w:type="spellEnd"/>
+      <w:r>
+        <w:rPr>
+          <w:rFonts w:ascii="Calibri" w:hAnsi="Calibri" w:cs="Calibri"/>
+          <w:i/>
+          <w:iCs/>
+          <w:lang w:val="es-ES"/>
+        </w:rPr>
+        <w:t>, Git, GitHub</w:t>
       </w:r>
       <w:r>
         <w:rPr>
@@ -593,7 +849,27 @@
           <w:iCs/>
           <w:lang w:val="es-ES"/>
         </w:rPr>
-        <w:t>Apoyé en el desarrollo del sistema de Posgrado mediante la implementación y mejora de interfaces, incorporando validaciones de datos e integridad de campos y realizando la conexión de las interfaces con el backend.</w:t>
+        <w:t xml:space="preserve">Apoyé en el desarrollo del sistema de Posgrado mediante la implementación y mejora de interfaces, incorporando validaciones de datos e integridad de campos y realizando la conexión de las interfaces con el </w:t>
+      </w:r>
+      <w:proofErr w:type="spellStart"/>
+      <w:r>
+        <w:rPr>
+          <w:rFonts w:ascii="Calibri" w:hAnsi="Calibri" w:cs="Calibri"/>
+          <w:i/>
+          <w:iCs/>
+          <w:lang w:val="es-ES"/>
+        </w:rPr>
+        <w:t>backend</w:t>
+      </w:r>
+      <w:proofErr w:type="spellEnd"/>
+      <w:r>
+        <w:rPr>
+          <w:rFonts w:ascii="Calibri" w:hAnsi="Calibri" w:cs="Calibri"/>
+          <w:i/>
+          <w:iCs/>
+          <w:lang w:val="es-ES"/>
+        </w:rPr>
+        <w:t>.</w:t>
       </w:r>
     </w:p>
     <w:p>
@@ -672,7 +948,27 @@
           <w:iCs/>
           <w:lang w:val="es-ES"/>
         </w:rPr>
-        <w:t>estableciendo un proceso formal de testing previo al despliegue</w:t>
+        <w:t xml:space="preserve">estableciendo un proceso formal de </w:t>
+      </w:r>
+      <w:proofErr w:type="spellStart"/>
+      <w:r>
+        <w:rPr>
+          <w:rFonts w:ascii="Calibri" w:eastAsia="Calibri" w:hAnsi="Calibri" w:cs="Calibri"/>
+          <w:i/>
+          <w:iCs/>
+          <w:lang w:val="es-ES"/>
+        </w:rPr>
+        <w:t>testing</w:t>
+      </w:r>
+      <w:proofErr w:type="spellEnd"/>
+      <w:r>
+        <w:rPr>
+          <w:rFonts w:ascii="Calibri" w:eastAsia="Calibri" w:hAnsi="Calibri" w:cs="Calibri"/>
+          <w:i/>
+          <w:iCs/>
+          <w:lang w:val="es-ES"/>
+        </w:rPr>
+        <w:t xml:space="preserve"> previo al despliegue</w:t>
       </w:r>
       <w:r>
         <w:rPr>
@@ -731,7 +1027,67 @@
           <w:iCs/>
           <w:lang w:val="es-ES"/>
         </w:rPr>
-        <w:t xml:space="preserve">Automaticé pruebas funcionales con Selenium IDE y validaciones backend con Python y Google Colab en </w:t>
+        <w:t xml:space="preserve">Automaticé pruebas funcionales con </w:t>
+      </w:r>
+      <w:proofErr w:type="spellStart"/>
+      <w:r>
+        <w:rPr>
+          <w:rFonts w:ascii="Calibri" w:eastAsia="Calibri" w:hAnsi="Calibri" w:cs="Calibri"/>
+          <w:i/>
+          <w:iCs/>
+          <w:lang w:val="es-ES"/>
+        </w:rPr>
+        <w:t>Selenium</w:t>
+      </w:r>
+      <w:proofErr w:type="spellEnd"/>
+      <w:r>
+        <w:rPr>
+          <w:rFonts w:ascii="Calibri" w:eastAsia="Calibri" w:hAnsi="Calibri" w:cs="Calibri"/>
+          <w:i/>
+          <w:iCs/>
+          <w:lang w:val="es-ES"/>
+        </w:rPr>
+        <w:t xml:space="preserve"> IDE y validaciones </w:t>
+      </w:r>
+      <w:proofErr w:type="spellStart"/>
+      <w:r>
+        <w:rPr>
+          <w:rFonts w:ascii="Calibri" w:eastAsia="Calibri" w:hAnsi="Calibri" w:cs="Calibri"/>
+          <w:i/>
+          <w:iCs/>
+          <w:lang w:val="es-ES"/>
+        </w:rPr>
+        <w:t>backend</w:t>
+      </w:r>
+      <w:proofErr w:type="spellEnd"/>
+      <w:r>
+        <w:rPr>
+          <w:rFonts w:ascii="Calibri" w:eastAsia="Calibri" w:hAnsi="Calibri" w:cs="Calibri"/>
+          <w:i/>
+          <w:iCs/>
+          <w:lang w:val="es-ES"/>
+        </w:rPr>
+        <w:t xml:space="preserve"> con Python y Google </w:t>
+      </w:r>
+      <w:proofErr w:type="spellStart"/>
+      <w:r>
+        <w:rPr>
+          <w:rFonts w:ascii="Calibri" w:eastAsia="Calibri" w:hAnsi="Calibri" w:cs="Calibri"/>
+          <w:i/>
+          <w:iCs/>
+          <w:lang w:val="es-ES"/>
+        </w:rPr>
+        <w:t>Colab</w:t>
+      </w:r>
+      <w:proofErr w:type="spellEnd"/>
+      <w:r>
+        <w:rPr>
+          <w:rFonts w:ascii="Calibri" w:eastAsia="Calibri" w:hAnsi="Calibri" w:cs="Calibri"/>
+          <w:i/>
+          <w:iCs/>
+          <w:lang w:val="es-ES"/>
+        </w:rPr>
+        <w:t xml:space="preserve"> en </w:t>
       </w:r>
       <w:r>
         <w:rPr>
@@ -799,14 +1155,25 @@
           <w:lang w:val="es-ES"/>
         </w:rPr>
       </w:pPr>
-      <w:r>
-        <w:rPr>
-          <w:rFonts w:ascii="Calibri" w:hAnsi="Calibri" w:cs="Calibri"/>
-          <w:i/>
-          <w:iCs/>
-          <w:lang w:val="es-ES"/>
-        </w:rPr>
-        <w:t>Reejecuté los casos fallidos después de las correcciones para validar su solución</w:t>
+      <w:proofErr w:type="spellStart"/>
+      <w:r>
+        <w:rPr>
+          <w:rFonts w:ascii="Calibri" w:hAnsi="Calibri" w:cs="Calibri"/>
+          <w:i/>
+          <w:iCs/>
+          <w:lang w:val="es-ES"/>
+        </w:rPr>
+        <w:t>Reejecuté</w:t>
+      </w:r>
+      <w:proofErr w:type="spellEnd"/>
+      <w:r>
+        <w:rPr>
+          <w:rFonts w:ascii="Calibri" w:hAnsi="Calibri" w:cs="Calibri"/>
+          <w:i/>
+          <w:iCs/>
+          <w:lang w:val="es-ES"/>
+        </w:rPr>
+        <w:t xml:space="preserve"> los casos fallidos después de las correcciones para validar su solución</w:t>
       </w:r>
       <w:r>
         <w:rPr>
@@ -884,7 +1251,25 @@
           <w:i/>
           <w:iCs/>
         </w:rPr>
-        <w:t xml:space="preserve">: Selenium IDE, Python, Jupyter Notebook, Google Colab, </w:t>
+        <w:t xml:space="preserve">: Selenium IDE, Python, Jupyter Notebook, Google </w:t>
+      </w:r>
+      <w:proofErr w:type="spellStart"/>
+      <w:r>
+        <w:rPr>
+          <w:rFonts w:ascii="Calibri" w:eastAsia="Calibri" w:hAnsi="Calibri" w:cs="Calibri"/>
+          <w:i/>
+          <w:iCs/>
+        </w:rPr>
+        <w:t>Colab</w:t>
+      </w:r>
+      <w:proofErr w:type="spellEnd"/>
+      <w:r>
+        <w:rPr>
+          <w:rFonts w:ascii="Calibri" w:eastAsia="Calibri" w:hAnsi="Calibri" w:cs="Calibri"/>
+          <w:i/>
+          <w:iCs/>
+        </w:rPr>
+        <w:t xml:space="preserve">, </w:t>
       </w:r>
       <w:r>
         <w:rPr>
@@ -926,6 +1311,18 @@
         </w:rPr>
         <w:t>PROYECTOS</w:t>
       </w:r>
+      <w:r>
+        <w:rPr>
+          <w:rFonts w:ascii="Calibri" w:eastAsia="Calibri" w:hAnsi="Calibri" w:cs="Calibri"/>
+          <w:b/>
+          <w:bCs/>
+          <w:color w:val="1F4E79"/>
+          <w:sz w:val="22"/>
+          <w:szCs w:val="22"/>
+          <w:lang w:val="es-ES"/>
+        </w:rPr>
+        <w:t xml:space="preserve"> </w:t>
+      </w:r>
     </w:p>
     <w:p>
       <w:pPr>
@@ -976,7 +1373,7 @@
           <w:iCs/>
           <w:lang w:val="es-ES"/>
         </w:rPr>
-        <w:t xml:space="preserve">UNU - </w:t>
+        <w:t xml:space="preserve"> </w:t>
       </w:r>
       <w:r>
         <w:rPr>
@@ -1020,7 +1417,36 @@
           <w:iCs/>
           <w:lang w:val="es-ES"/>
         </w:rPr>
-        <w:t xml:space="preserve">Aplicación web full-stack para reportar </w:t>
+        <w:t>Aplicación web full</w:t>
+      </w:r>
+      <w:r>
+        <w:rPr>
+          <w:rFonts w:ascii="Calibri" w:eastAsia="Calibri" w:hAnsi="Calibri" w:cs="Calibri"/>
+          <w:i/>
+          <w:iCs/>
+          <w:lang w:val="es-ES"/>
+        </w:rPr>
+        <w:t xml:space="preserve"> </w:t>
+      </w:r>
+      <w:proofErr w:type="spellStart"/>
+      <w:r>
+        <w:rPr>
+          <w:rFonts w:ascii="Calibri" w:eastAsia="Calibri" w:hAnsi="Calibri" w:cs="Calibri"/>
+          <w:i/>
+          <w:iCs/>
+          <w:lang w:val="es-ES"/>
+        </w:rPr>
+        <w:t>stack</w:t>
+      </w:r>
+      <w:proofErr w:type="spellEnd"/>
+      <w:r>
+        <w:rPr>
+          <w:rFonts w:ascii="Calibri" w:eastAsia="Calibri" w:hAnsi="Calibri" w:cs="Calibri"/>
+          <w:i/>
+          <w:iCs/>
+          <w:lang w:val="es-ES"/>
+        </w:rPr>
+        <w:t xml:space="preserve"> para reportar </w:t>
       </w:r>
       <w:r>
         <w:rPr>
@@ -1047,7 +1473,16 @@
           <w:iCs/>
           <w:lang w:val="es-ES"/>
         </w:rPr>
-        <w:t>incidencias de infraestructura del campus. Desarrollé el módulo del estudiante para registrar, consultar y editar reportes con fotografía, tipo de incidencia y ubicación, trabajando con Scrum</w:t>
+        <w:t>incidencias de infraestructura del campus</w:t>
+      </w:r>
+      <w:r>
+        <w:rPr>
+          <w:rFonts w:ascii="Calibri" w:eastAsia="Calibri" w:hAnsi="Calibri" w:cs="Calibri"/>
+          <w:i/>
+          <w:iCs/>
+          <w:lang w:val="es-ES"/>
+        </w:rPr>
+        <w:t xml:space="preserve"> de la UNU (Universidad Nacional de Ucayali)</w:t>
       </w:r>
       <w:r>
         <w:rPr>
@@ -1274,7 +1709,27 @@
           <w:iCs/>
           <w:lang w:val="es-ES"/>
         </w:rPr>
-        <w:t>Sistema web para optimizar la asignación almacén–zona sobre un mapa real, utilizando distancias por calle y respaldo automático ante fallos del servicio de rutas. Implementé algoritmos de optimización con KPIs de costo, distancia y utilización</w:t>
+        <w:t xml:space="preserve">Sistema web para optimizar la asignación almacén–zona sobre un mapa real, utilizando distancias por calle y respaldo automático ante fallos del servicio de rutas. Implementé algoritmos de optimización con </w:t>
+      </w:r>
+      <w:proofErr w:type="spellStart"/>
+      <w:r>
+        <w:rPr>
+          <w:rFonts w:ascii="Calibri" w:eastAsia="Calibri" w:hAnsi="Calibri" w:cs="Calibri"/>
+          <w:i/>
+          <w:iCs/>
+          <w:lang w:val="es-ES"/>
+        </w:rPr>
+        <w:t>KPIs</w:t>
+      </w:r>
+      <w:proofErr w:type="spellEnd"/>
+      <w:r>
+        <w:rPr>
+          <w:rFonts w:ascii="Calibri" w:eastAsia="Calibri" w:hAnsi="Calibri" w:cs="Calibri"/>
+          <w:i/>
+          <w:iCs/>
+          <w:lang w:val="es-ES"/>
+        </w:rPr>
+        <w:t xml:space="preserve"> de costo, distancia y utilización</w:t>
       </w:r>
       <w:r>
         <w:rPr>
@@ -1474,6 +1929,7 @@
           <w:lang w:val="es-ES"/>
         </w:rPr>
       </w:pPr>
+      <w:proofErr w:type="spellStart"/>
       <w:r>
         <w:rPr>
           <w:rFonts w:ascii="Calibri" w:eastAsia="Calibri" w:hAnsi="Calibri" w:cs="Calibri"/>
@@ -1483,7 +1939,19 @@
           <w:szCs w:val="21"/>
           <w:lang w:val="es-ES"/>
         </w:rPr>
-        <w:t>RotaStock Plus — Control de Inventario</w:t>
+        <w:t>RotaStock</w:t>
+      </w:r>
+      <w:proofErr w:type="spellEnd"/>
+      <w:r>
+        <w:rPr>
+          <w:rFonts w:ascii="Calibri" w:eastAsia="Calibri" w:hAnsi="Calibri" w:cs="Calibri"/>
+          <w:b/>
+          <w:bCs/>
+          <w:sz w:val="21"/>
+          <w:szCs w:val="21"/>
+          <w:lang w:val="es-ES"/>
+        </w:rPr>
+        <w:t xml:space="preserve"> Plus — Control de Inventario</w:t>
       </w:r>
       <w:r>
         <w:rPr>
@@ -1519,6 +1987,7 @@
           <w:iCs/>
           <w:lang w:val="es-ES"/>
         </w:rPr>
+        <w:lastRenderedPageBreak/>
         <w:t>Aplicación de escritorio offline para gestionar el ciclo completo del almacén, con FIFO, semaforización de rotación, clasificación ABC/XYZ, plan de compras, conteos auditables e informes en PDF y Excel. Diseñé e implementé la lógica de negocio y persistencia con copias de seguridad automáticas</w:t>
       </w:r>
       <w:r>
@@ -1556,7 +2025,6 @@
           <w:iCs/>
           <w:lang w:val="es-ES"/>
         </w:rPr>
-        <w:lastRenderedPageBreak/>
         <w:t>Stack</w:t>
       </w:r>
       <w:r>
@@ -1575,7 +2043,27 @@
           <w:iCs/>
           <w:lang w:val="es-ES"/>
         </w:rPr>
-        <w:t>JavaScript, Electron, persistencia JSON</w:t>
+        <w:t xml:space="preserve">JavaScript, </w:t>
+      </w:r>
+      <w:proofErr w:type="spellStart"/>
+      <w:r>
+        <w:rPr>
+          <w:rFonts w:ascii="Calibri" w:eastAsia="Calibri" w:hAnsi="Calibri" w:cs="Calibri"/>
+          <w:i/>
+          <w:iCs/>
+          <w:lang w:val="es-ES"/>
+        </w:rPr>
+        <w:t>Electron</w:t>
+      </w:r>
+      <w:proofErr w:type="spellEnd"/>
+      <w:r>
+        <w:rPr>
+          <w:rFonts w:ascii="Calibri" w:eastAsia="Calibri" w:hAnsi="Calibri" w:cs="Calibri"/>
+          <w:i/>
+          <w:iCs/>
+          <w:lang w:val="es-ES"/>
+        </w:rPr>
+        <w:t>, persistencia JSON</w:t>
       </w:r>
       <w:r>
         <w:rPr>
@@ -1711,25 +2199,7 @@
           <w:lang w:val="es-ES"/>
         </w:rPr>
         <w:tab/>
-        <w:t xml:space="preserve">2022 – Actualidad (Ciclo </w:t>
-      </w:r>
-      <w:r>
-        <w:rPr>
-          <w:rFonts w:ascii="Calibri" w:eastAsia="Calibri" w:hAnsi="Calibri" w:cs="Calibri"/>
-          <w:i/>
-          <w:iCs/>
-          <w:lang w:val="es-ES"/>
-        </w:rPr>
-        <w:t>I</w:t>
-      </w:r>
-      <w:r>
-        <w:rPr>
-          <w:rFonts w:ascii="Calibri" w:eastAsia="Calibri" w:hAnsi="Calibri" w:cs="Calibri"/>
-          <w:i/>
-          <w:iCs/>
-          <w:lang w:val="es-ES"/>
-        </w:rPr>
-        <w:t>X)</w:t>
+        <w:t>2022 – Actualidad (Ciclo X)</w:t>
       </w:r>
     </w:p>
     <w:p>

</xml_diff>

<commit_message>
Actualiza el CV y elimina la plantilla
Actualiza el documento CV - RFPG.docx y elimina CV - plantilla.docx.
</commit_message>
<xml_diff>
--- a/CV/CV - RFPG.docx
+++ b/CV/CV - RFPG.docx
@@ -7,8 +7,10 @@
         <w:spacing w:line="276" w:lineRule="auto"/>
         <w:jc w:val="center"/>
         <w:rPr>
-          <w:sz w:val="38"/>
-          <w:szCs w:val="38"/>
+          <w:b/>
+          <w:bCs/>
+          <w:sz w:val="40"/>
+          <w:szCs w:val="40"/>
           <w:lang w:val="es-ES"/>
         </w:rPr>
       </w:pPr>
@@ -32,18 +34,14 @@
         <w:rPr>
           <w:i/>
           <w:iCs/>
-          <w:sz w:val="22"/>
-          <w:szCs w:val="22"/>
-          <w:lang w:val="es-ES"/>
-        </w:rPr>
-      </w:pPr>
-      <w:r>
-        <w:rPr>
-          <w:rFonts w:ascii="Calibri" w:eastAsia="Calibri" w:hAnsi="Calibri" w:cs="Calibri"/>
-          <w:i/>
-          <w:iCs/>
-          <w:sz w:val="22"/>
-          <w:szCs w:val="22"/>
+          <w:lang w:val="es-ES"/>
+        </w:rPr>
+      </w:pPr>
+      <w:r>
+        <w:rPr>
+          <w:rFonts w:ascii="Calibri" w:eastAsia="Calibri" w:hAnsi="Calibri" w:cs="Calibri"/>
+          <w:i/>
+          <w:iCs/>
           <w:lang w:val="es-ES"/>
         </w:rPr>
         <w:t>Estudiante de Ingeniería de Sistemas | Desarrollo de Software</w:t>
@@ -58,16 +56,12 @@
         <w:jc w:val="center"/>
         <w:rPr>
           <w:rFonts w:ascii="Calibri" w:hAnsi="Calibri" w:cs="Calibri"/>
-          <w:sz w:val="21"/>
-          <w:szCs w:val="21"/>
-          <w:lang w:val="es-ES"/>
-        </w:rPr>
-      </w:pPr>
-      <w:r>
-        <w:rPr>
-          <w:rFonts w:ascii="Calibri" w:eastAsia="Calibri" w:hAnsi="Calibri" w:cs="Calibri"/>
-          <w:sz w:val="22"/>
-          <w:szCs w:val="22"/>
+          <w:lang w:val="es-ES"/>
+        </w:rPr>
+      </w:pPr>
+      <w:r>
+        <w:rPr>
+          <w:rFonts w:ascii="Calibri" w:eastAsia="Calibri" w:hAnsi="Calibri" w:cs="Calibri"/>
           <w:lang w:val="es-ES"/>
         </w:rPr>
         <w:t>+51 922 149 396</w:t>
@@ -75,8 +69,6 @@
       <w:r>
         <w:rPr>
           <w:rFonts w:ascii="Calibri" w:eastAsia="Calibri" w:hAnsi="Calibri" w:cs="Calibri"/>
-          <w:sz w:val="22"/>
-          <w:szCs w:val="22"/>
           <w:lang w:val="es-ES"/>
         </w:rPr>
         <w:t xml:space="preserve"> </w:t>
@@ -84,8 +76,6 @@
       <w:r>
         <w:rPr>
           <w:rFonts w:ascii="Calibri" w:eastAsia="Calibri" w:hAnsi="Calibri" w:cs="Calibri"/>
-          <w:sz w:val="22"/>
-          <w:szCs w:val="22"/>
           <w:lang w:val="es-ES"/>
         </w:rPr>
         <w:t xml:space="preserve">| </w:t>
@@ -93,9 +83,7 @@
       <w:r>
         <w:rPr>
           <w:rFonts w:ascii="Calibri" w:eastAsia="Calibri" w:hAnsi="Calibri" w:cs="Calibri"/>
-          <w:color w:val="156082" w:themeColor="accent1"/>
-          <w:sz w:val="22"/>
-          <w:szCs w:val="22"/>
+          <w:color w:val="215E99" w:themeColor="text2" w:themeTint="BF"/>
           <w:lang w:val="es-ES"/>
         </w:rPr>
         <w:t xml:space="preserve">pedro.ricra.figueroa@gmail.com </w:t>
@@ -103,55 +91,41 @@
       <w:r>
         <w:rPr>
           <w:rFonts w:ascii="Calibri" w:eastAsia="Calibri" w:hAnsi="Calibri" w:cs="Calibri"/>
-          <w:sz w:val="22"/>
-          <w:szCs w:val="22"/>
           <w:lang w:val="es-ES"/>
         </w:rPr>
         <w:t xml:space="preserve">| Pucallpa, Perú | </w:t>
       </w:r>
       <w:hyperlink r:id="rId5" w:history="1">
-        <w:proofErr w:type="spellStart"/>
         <w:r>
           <w:rPr>
             <w:rStyle w:val="Hipervnculo"/>
             <w:rFonts w:ascii="Calibri" w:eastAsia="Calibri" w:hAnsi="Calibri" w:cs="Calibri"/>
-            <w:sz w:val="22"/>
-            <w:szCs w:val="22"/>
             <w:lang w:val="es-ES"/>
           </w:rPr>
-          <w:t>Github</w:t>
+          <w:t>GitHub</w:t>
         </w:r>
-        <w:proofErr w:type="spellEnd"/>
       </w:hyperlink>
       <w:r>
         <w:rPr>
           <w:rFonts w:ascii="Calibri" w:hAnsi="Calibri" w:cs="Calibri"/>
-          <w:sz w:val="22"/>
-          <w:szCs w:val="22"/>
           <w:lang w:val="es-ES"/>
         </w:rPr>
         <w:t xml:space="preserve"> | </w:t>
       </w:r>
       <w:hyperlink r:id="rId6" w:history="1">
-        <w:proofErr w:type="spellStart"/>
         <w:r>
           <w:rPr>
             <w:rStyle w:val="Hipervnculo"/>
             <w:rFonts w:ascii="Calibri" w:hAnsi="Calibri" w:cs="Calibri"/>
-            <w:sz w:val="22"/>
-            <w:szCs w:val="22"/>
             <w:lang w:val="es-ES"/>
           </w:rPr>
-          <w:t>Linkedin</w:t>
+          <w:t>LinkedIn</w:t>
         </w:r>
-        <w:proofErr w:type="spellEnd"/>
       </w:hyperlink>
       <w:r>
         <w:rPr>
           <w:rFonts w:ascii="Calibri" w:eastAsia="Calibri" w:hAnsi="Calibri" w:cs="Calibri"/>
           <w:color w:val="156082" w:themeColor="accent1"/>
-          <w:sz w:val="22"/>
-          <w:szCs w:val="22"/>
           <w:lang w:val="es-ES"/>
         </w:rPr>
         <w:t xml:space="preserve"> </w:t>
@@ -159,8 +133,6 @@
       <w:r>
         <w:rPr>
           <w:rFonts w:ascii="Calibri" w:eastAsia="Calibri" w:hAnsi="Calibri" w:cs="Calibri"/>
-          <w:sz w:val="22"/>
-          <w:szCs w:val="22"/>
           <w:lang w:val="es-ES"/>
         </w:rPr>
         <w:t xml:space="preserve">| </w:t>
@@ -170,8 +142,6 @@
           <w:rPr>
             <w:rStyle w:val="Hipervnculo"/>
             <w:rFonts w:ascii="Calibri" w:eastAsia="Calibri" w:hAnsi="Calibri" w:cs="Calibri"/>
-            <w:sz w:val="22"/>
-            <w:szCs w:val="22"/>
             <w:lang w:val="es-ES"/>
           </w:rPr>
           <w:t>Portafolio</w:t>
@@ -199,27 +169,93 @@
           <w:szCs w:val="22"/>
           <w:lang w:val="es-ES"/>
         </w:rPr>
-        <w:t>RESUMEN PROFESIONAL</w:t>
-      </w:r>
-    </w:p>
-    <w:p>
-      <w:pPr>
-        <w:spacing w:line="276" w:lineRule="auto"/>
-        <w:jc w:val="both"/>
-        <w:rPr>
-          <w:i/>
-          <w:iCs/>
-          <w:lang w:val="es-ES"/>
-        </w:rPr>
-      </w:pPr>
-      <w:r>
-        <w:rPr>
-          <w:rFonts w:ascii="Calibri" w:eastAsia="Calibri" w:hAnsi="Calibri" w:cs="Calibri"/>
-          <w:i/>
-          <w:iCs/>
-          <w:lang w:val="es-ES"/>
-        </w:rPr>
-        <w:t xml:space="preserve">Estudiante de Ingeniería de Sistemas (X ciclo) con experiencia práctica en desarrollo de software y </w:t>
+        <w:t>PERFIL</w:t>
+      </w:r>
+      <w:r>
+        <w:rPr>
+          <w:rFonts w:ascii="Calibri" w:eastAsia="Calibri" w:hAnsi="Calibri" w:cs="Calibri"/>
+          <w:b/>
+          <w:bCs/>
+          <w:color w:val="1F4E79"/>
+          <w:sz w:val="22"/>
+          <w:szCs w:val="22"/>
+          <w:lang w:val="es-ES"/>
+        </w:rPr>
+        <w:t xml:space="preserve"> PROFESIONAL</w:t>
+      </w:r>
+    </w:p>
+    <w:p>
+      <w:pPr>
+        <w:spacing w:line="276" w:lineRule="auto"/>
+        <w:jc w:val="both"/>
+        <w:rPr>
+          <w:i/>
+          <w:iCs/>
+          <w:lang w:val="es-ES"/>
+        </w:rPr>
+      </w:pPr>
+      <w:r>
+        <w:rPr>
+          <w:rFonts w:ascii="Calibri" w:eastAsia="Calibri" w:hAnsi="Calibri" w:cs="Calibri"/>
+          <w:i/>
+          <w:iCs/>
+          <w:lang w:val="es-ES"/>
+        </w:rPr>
+        <w:t>Estudiante de Ingeniería de Sistemas (</w:t>
+      </w:r>
+      <w:r>
+        <w:rPr>
+          <w:rFonts w:ascii="Calibri" w:eastAsia="Calibri" w:hAnsi="Calibri" w:cs="Calibri"/>
+          <w:i/>
+          <w:iCs/>
+          <w:lang w:val="es-ES"/>
+        </w:rPr>
+        <w:t>VIII</w:t>
+      </w:r>
+      <w:r>
+        <w:rPr>
+          <w:rFonts w:ascii="Calibri" w:eastAsia="Calibri" w:hAnsi="Calibri" w:cs="Calibri"/>
+          <w:i/>
+          <w:iCs/>
+          <w:lang w:val="es-ES"/>
+        </w:rPr>
+        <w:t xml:space="preserve"> ciclo</w:t>
+      </w:r>
+      <w:r>
+        <w:rPr>
+          <w:rFonts w:ascii="Calibri" w:eastAsia="Calibri" w:hAnsi="Calibri" w:cs="Calibri"/>
+          <w:i/>
+          <w:iCs/>
+          <w:lang w:val="es-ES"/>
+        </w:rPr>
+        <w:t xml:space="preserve"> relativo</w:t>
+      </w:r>
+      <w:r>
+        <w:rPr>
+          <w:rFonts w:ascii="Calibri" w:eastAsia="Calibri" w:hAnsi="Calibri" w:cs="Calibri"/>
+          <w:i/>
+          <w:iCs/>
+          <w:lang w:val="es-ES"/>
+        </w:rPr>
+        <w:t xml:space="preserve">) </w:t>
+      </w:r>
+      <w:r>
+        <w:rPr>
+          <w:rFonts w:ascii="Calibri" w:eastAsia="Calibri" w:hAnsi="Calibri" w:cs="Calibri"/>
+          <w:i/>
+          <w:iCs/>
+          <w:lang w:val="es-ES"/>
+        </w:rPr>
+        <w:t xml:space="preserve">en la Universidad Nacional de Ucayali, </w:t>
+      </w:r>
+      <w:r>
+        <w:rPr>
+          <w:rFonts w:ascii="Calibri" w:eastAsia="Calibri" w:hAnsi="Calibri" w:cs="Calibri"/>
+          <w:i/>
+          <w:iCs/>
+          <w:lang w:val="es-ES"/>
+        </w:rPr>
+        <w:t xml:space="preserve">con experiencia práctica en desarrollo de software y </w:t>
       </w:r>
       <w:proofErr w:type="spellStart"/>
       <w:r>
@@ -259,7 +295,7 @@
           <w:iCs/>
           <w:lang w:val="es-ES"/>
         </w:rPr>
-        <w:t>–</w:t>
+        <w:t xml:space="preserve"> y </w:t>
       </w:r>
       <w:proofErr w:type="spellStart"/>
       <w:r>
@@ -279,7 +315,61 @@
           <w:iCs/>
           <w:lang w:val="es-ES"/>
         </w:rPr>
-        <w:t>, diseño de bases de datos y automatización de pruebas. Experiencia trabajando con HTML, CSS, JavaScript, Angular, Node.js y MySQL, así como en equipos.</w:t>
+        <w:t>, diseño de bases de datos y automatización de pruebas. Experiencia trabajando con HTML, CSS, JavaScript, Angular, Node.js</w:t>
+      </w:r>
+      <w:r>
+        <w:rPr>
+          <w:rFonts w:ascii="Calibri" w:eastAsia="Calibri" w:hAnsi="Calibri" w:cs="Calibri"/>
+          <w:i/>
+          <w:iCs/>
+          <w:lang w:val="es-ES"/>
+        </w:rPr>
+        <w:t>,</w:t>
+      </w:r>
+      <w:r>
+        <w:rPr>
+          <w:rFonts w:ascii="Calibri" w:eastAsia="Calibri" w:hAnsi="Calibri" w:cs="Calibri"/>
+          <w:i/>
+          <w:iCs/>
+          <w:lang w:val="es-ES"/>
+        </w:rPr>
+        <w:t xml:space="preserve"> </w:t>
+      </w:r>
+      <w:r>
+        <w:rPr>
+          <w:rFonts w:ascii="Calibri" w:eastAsia="Calibri" w:hAnsi="Calibri" w:cs="Calibri"/>
+          <w:i/>
+          <w:iCs/>
+          <w:lang w:val="es-ES"/>
+        </w:rPr>
+        <w:t>MySQL, trabajando</w:t>
+      </w:r>
+      <w:r>
+        <w:rPr>
+          <w:rFonts w:ascii="Calibri" w:eastAsia="Calibri" w:hAnsi="Calibri" w:cs="Calibri"/>
+          <w:i/>
+          <w:iCs/>
+          <w:lang w:val="es-ES"/>
+        </w:rPr>
+        <w:t xml:space="preserve"> en equipo</w:t>
+      </w:r>
+      <w:r>
+        <w:rPr>
+          <w:rFonts w:ascii="Calibri" w:eastAsia="Calibri" w:hAnsi="Calibri" w:cs="Calibri"/>
+          <w:i/>
+          <w:iCs/>
+          <w:lang w:val="es-ES"/>
+        </w:rPr>
+        <w:t xml:space="preserve"> y 5 sistemas publicados</w:t>
+      </w:r>
+      <w:r>
+        <w:rPr>
+          <w:rFonts w:ascii="Calibri" w:eastAsia="Calibri" w:hAnsi="Calibri" w:cs="Calibri"/>
+          <w:i/>
+          <w:iCs/>
+          <w:lang w:val="es-ES"/>
+        </w:rPr>
+        <w:t>.</w:t>
       </w:r>
     </w:p>
     <w:p>
@@ -305,6 +395,18 @@
         </w:rPr>
         <w:t>HABILIDADES TÉCNICAS</w:t>
       </w:r>
+      <w:r>
+        <w:rPr>
+          <w:rFonts w:ascii="Calibri" w:eastAsia="Calibri" w:hAnsi="Calibri" w:cs="Calibri"/>
+          <w:b/>
+          <w:bCs/>
+          <w:color w:val="1F4E79"/>
+          <w:sz w:val="22"/>
+          <w:szCs w:val="22"/>
+          <w:lang w:val="es-ES"/>
+        </w:rPr>
+        <w:t xml:space="preserve"> Y COMPETENCIAS</w:t>
+      </w:r>
     </w:p>
     <w:p>
       <w:pPr>
@@ -663,27 +765,75 @@
           <w:iCs/>
           <w:lang w:val="es-ES"/>
         </w:rPr>
-        <w:t xml:space="preserve">Docker, Docker </w:t>
-      </w:r>
-      <w:proofErr w:type="spellStart"/>
-      <w:r>
-        <w:rPr>
-          <w:rFonts w:ascii="Calibri" w:hAnsi="Calibri" w:cs="Calibri"/>
-          <w:i/>
-          <w:iCs/>
-          <w:lang w:val="es-ES"/>
-        </w:rPr>
-        <w:t>Compose</w:t>
-      </w:r>
-      <w:proofErr w:type="spellEnd"/>
-      <w:r>
-        <w:rPr>
-          <w:rFonts w:ascii="Calibri" w:hAnsi="Calibri" w:cs="Calibri"/>
-          <w:i/>
-          <w:iCs/>
-          <w:lang w:val="es-ES"/>
-        </w:rPr>
-        <w:t>, Git, GitHub</w:t>
+        <w:t>Docker, Git, GitHub</w:t>
+      </w:r>
+      <w:r>
+        <w:rPr>
+          <w:rFonts w:ascii="Calibri" w:hAnsi="Calibri" w:cs="Calibri"/>
+          <w:i/>
+          <w:iCs/>
+          <w:lang w:val="es-ES"/>
+        </w:rPr>
+        <w:t>.</w:t>
+      </w:r>
+    </w:p>
+    <w:p>
+      <w:pPr>
+        <w:spacing w:line="276" w:lineRule="auto"/>
+        <w:jc w:val="both"/>
+        <w:rPr>
+          <w:rFonts w:ascii="Calibri" w:hAnsi="Calibri" w:cs="Calibri"/>
+          <w:i/>
+          <w:iCs/>
+          <w:lang w:val="es-ES"/>
+        </w:rPr>
+      </w:pPr>
+      <w:r>
+        <w:rPr>
+          <w:rFonts w:ascii="Calibri" w:hAnsi="Calibri" w:cs="Calibri"/>
+          <w:b/>
+          <w:bCs/>
+          <w:i/>
+          <w:iCs/>
+          <w:lang w:val="es-ES"/>
+        </w:rPr>
+        <w:t xml:space="preserve">Competencias Profesionales: </w:t>
+      </w:r>
+      <w:r>
+        <w:rPr>
+          <w:rFonts w:ascii="Calibri" w:hAnsi="Calibri" w:cs="Calibri"/>
+          <w:i/>
+          <w:iCs/>
+          <w:lang w:val="es-ES"/>
+        </w:rPr>
+        <w:t>C</w:t>
+      </w:r>
+      <w:r>
+        <w:rPr>
+          <w:rFonts w:ascii="Calibri" w:hAnsi="Calibri" w:cs="Calibri"/>
+          <w:i/>
+          <w:iCs/>
+          <w:lang w:val="es-ES"/>
+        </w:rPr>
+        <w:t>omunicación técnica, trabajo en equipo, pensamiento analítico, orientación a la calidad, proactividad</w:t>
+      </w:r>
+      <w:r>
+        <w:rPr>
+          <w:rFonts w:ascii="Calibri" w:hAnsi="Calibri" w:cs="Calibri"/>
+          <w:i/>
+          <w:iCs/>
+          <w:lang w:val="es-ES"/>
+        </w:rPr>
+        <w:t xml:space="preserve"> y</w:t>
+      </w:r>
+      <w:r>
+        <w:rPr>
+          <w:rFonts w:ascii="Calibri" w:hAnsi="Calibri" w:cs="Calibri"/>
+          <w:i/>
+          <w:iCs/>
+          <w:lang w:val="es-ES"/>
+        </w:rPr>
+        <w:t xml:space="preserve"> aprendizaje continuo</w:t>
       </w:r>
       <w:r>
         <w:rPr>
@@ -717,7 +867,19 @@
           <w:szCs w:val="22"/>
           <w:lang w:val="es-ES"/>
         </w:rPr>
-        <w:t>EXPERIENCIA LABORAL</w:t>
+        <w:t xml:space="preserve">EXPERIENCIA </w:t>
+      </w:r>
+      <w:r>
+        <w:rPr>
+          <w:rFonts w:ascii="Calibri" w:eastAsia="Calibri" w:hAnsi="Calibri" w:cs="Calibri"/>
+          <w:b/>
+          <w:bCs/>
+          <w:color w:val="1F4E79"/>
+          <w:sz w:val="22"/>
+          <w:szCs w:val="22"/>
+          <w:lang w:val="es-ES"/>
+        </w:rPr>
+        <w:t>PROFESIONAL</w:t>
       </w:r>
     </w:p>
     <w:p>
@@ -740,7 +902,7 @@
           <w:szCs w:val="21"/>
           <w:lang w:val="es-ES"/>
         </w:rPr>
-        <w:t>Practicante — Área de</w:t>
+        <w:t>Practicante —</w:t>
       </w:r>
       <w:r>
         <w:rPr>
@@ -1198,26 +1360,132 @@
           <w:rFonts w:ascii="Calibri" w:hAnsi="Calibri" w:cs="Calibri"/>
           <w:i/>
           <w:iCs/>
-          <w:lang w:val="es-ES"/>
-        </w:rPr>
-      </w:pPr>
-      <w:r>
-        <w:rPr>
-          <w:rFonts w:ascii="Calibri" w:eastAsia="Calibri" w:hAnsi="Calibri" w:cs="Calibri"/>
-          <w:i/>
-          <w:iCs/>
-          <w:lang w:val="es-ES"/>
-        </w:rPr>
-        <w:t>Realicé el registro biométrico mediante huella y reconocimiento facial del personal de la Facultad de Ciencias de la Salud</w:t>
-      </w:r>
-      <w:r>
-        <w:rPr>
-          <w:rFonts w:ascii="Calibri" w:eastAsia="Calibri" w:hAnsi="Calibri" w:cs="Calibri"/>
-          <w:i/>
-          <w:iCs/>
-          <w:lang w:val="es-ES"/>
-        </w:rPr>
-        <w:t>.</w:t>
+        </w:rPr>
+      </w:pPr>
+      <w:r>
+        <w:rPr>
+          <w:rFonts w:ascii="Calibri" w:eastAsia="Calibri" w:hAnsi="Calibri" w:cs="Calibri"/>
+          <w:b/>
+          <w:bCs/>
+          <w:i/>
+          <w:iCs/>
+        </w:rPr>
+        <w:t>Herramientas</w:t>
+      </w:r>
+      <w:r>
+        <w:rPr>
+          <w:rFonts w:ascii="Calibri" w:eastAsia="Calibri" w:hAnsi="Calibri" w:cs="Calibri"/>
+          <w:i/>
+          <w:iCs/>
+        </w:rPr>
+        <w:t xml:space="preserve">: Selenium IDE, Python, Jupyter Notebook, Google </w:t>
+      </w:r>
+      <w:proofErr w:type="spellStart"/>
+      <w:r>
+        <w:rPr>
+          <w:rFonts w:ascii="Calibri" w:eastAsia="Calibri" w:hAnsi="Calibri" w:cs="Calibri"/>
+          <w:i/>
+          <w:iCs/>
+        </w:rPr>
+        <w:t>Colab</w:t>
+      </w:r>
+      <w:proofErr w:type="spellEnd"/>
+      <w:r>
+        <w:rPr>
+          <w:rFonts w:ascii="Calibri" w:eastAsia="Calibri" w:hAnsi="Calibri" w:cs="Calibri"/>
+          <w:i/>
+          <w:iCs/>
+        </w:rPr>
+        <w:t xml:space="preserve">, </w:t>
+      </w:r>
+      <w:r>
+        <w:rPr>
+          <w:rFonts w:ascii="Calibri" w:eastAsia="Calibri" w:hAnsi="Calibri" w:cs="Calibri"/>
+          <w:i/>
+          <w:iCs/>
+        </w:rPr>
+        <w:t xml:space="preserve">Git y </w:t>
+      </w:r>
+      <w:r>
+        <w:rPr>
+          <w:rFonts w:ascii="Calibri" w:eastAsia="Calibri" w:hAnsi="Calibri" w:cs="Calibri"/>
+          <w:i/>
+          <w:iCs/>
+        </w:rPr>
+        <w:t>GitHub.</w:t>
+      </w:r>
+    </w:p>
+    <w:p>
+      <w:pPr>
+        <w:spacing w:line="276" w:lineRule="auto"/>
+        <w:jc w:val="both"/>
+        <w:rPr>
+          <w:rFonts w:ascii="Calibri" w:hAnsi="Calibri" w:cs="Calibri"/>
+        </w:rPr>
+      </w:pPr>
+    </w:p>
+    <w:p>
+      <w:pPr>
+        <w:tabs>
+          <w:tab w:val="right" w:pos="9360"/>
+        </w:tabs>
+        <w:spacing w:line="276" w:lineRule="auto"/>
+        <w:jc w:val="both"/>
+        <w:rPr>
+          <w:lang w:val="es-ES"/>
+        </w:rPr>
+      </w:pPr>
+      <w:r>
+        <w:rPr>
+          <w:rFonts w:ascii="Calibri" w:eastAsia="Calibri" w:hAnsi="Calibri" w:cs="Calibri"/>
+          <w:b/>
+          <w:bCs/>
+          <w:sz w:val="21"/>
+          <w:szCs w:val="21"/>
+          <w:lang w:val="es-ES"/>
+        </w:rPr>
+        <w:t>Desarrollador de Software Independiente</w:t>
+      </w:r>
+      <w:r>
+        <w:rPr>
+          <w:rFonts w:ascii="Calibri" w:eastAsia="Calibri" w:hAnsi="Calibri" w:cs="Calibri"/>
+          <w:i/>
+          <w:iCs/>
+          <w:lang w:val="es-ES"/>
+        </w:rPr>
+        <w:tab/>
+        <w:t xml:space="preserve">2025 – </w:t>
+      </w:r>
+      <w:r>
+        <w:rPr>
+          <w:rFonts w:ascii="Calibri" w:eastAsia="Calibri" w:hAnsi="Calibri" w:cs="Calibri"/>
+          <w:i/>
+          <w:iCs/>
+          <w:lang w:val="es-ES"/>
+        </w:rPr>
+        <w:t>Actualidad</w:t>
+      </w:r>
+    </w:p>
+    <w:p>
+      <w:pPr>
+        <w:spacing w:line="276" w:lineRule="auto"/>
+        <w:jc w:val="both"/>
+        <w:rPr>
+          <w:sz w:val="21"/>
+          <w:szCs w:val="21"/>
+          <w:lang w:val="es-ES"/>
+        </w:rPr>
+      </w:pPr>
+      <w:r>
+        <w:rPr>
+          <w:rFonts w:ascii="Calibri" w:eastAsia="Calibri" w:hAnsi="Calibri" w:cs="Calibri"/>
+          <w:i/>
+          <w:iCs/>
+          <w:sz w:val="21"/>
+          <w:szCs w:val="21"/>
+          <w:lang w:val="es-ES"/>
+        </w:rPr>
+        <w:t>Proyectos propios</w:t>
       </w:r>
     </w:p>
     <w:p>
@@ -1233,59 +1501,53 @@
           <w:rFonts w:ascii="Calibri" w:hAnsi="Calibri" w:cs="Calibri"/>
           <w:i/>
           <w:iCs/>
-        </w:rPr>
-      </w:pPr>
-      <w:r>
-        <w:rPr>
-          <w:rFonts w:ascii="Calibri" w:eastAsia="Calibri" w:hAnsi="Calibri" w:cs="Calibri"/>
-          <w:b/>
-          <w:bCs/>
-          <w:i/>
-          <w:iCs/>
-        </w:rPr>
-        <w:t>Herramientas</w:t>
-      </w:r>
-      <w:r>
-        <w:rPr>
-          <w:rFonts w:ascii="Calibri" w:eastAsia="Calibri" w:hAnsi="Calibri" w:cs="Calibri"/>
-          <w:i/>
-          <w:iCs/>
-        </w:rPr>
-        <w:t xml:space="preserve">: Selenium IDE, Python, Jupyter Notebook, Google </w:t>
-      </w:r>
-      <w:proofErr w:type="spellStart"/>
-      <w:r>
-        <w:rPr>
-          <w:rFonts w:ascii="Calibri" w:eastAsia="Calibri" w:hAnsi="Calibri" w:cs="Calibri"/>
-          <w:i/>
-          <w:iCs/>
-        </w:rPr>
-        <w:t>Colab</w:t>
-      </w:r>
-      <w:proofErr w:type="spellEnd"/>
-      <w:r>
-        <w:rPr>
-          <w:rFonts w:ascii="Calibri" w:eastAsia="Calibri" w:hAnsi="Calibri" w:cs="Calibri"/>
-          <w:i/>
-          <w:iCs/>
-        </w:rPr>
-        <w:t xml:space="preserve">, </w:t>
-      </w:r>
-      <w:r>
-        <w:rPr>
-          <w:rFonts w:ascii="Calibri" w:eastAsia="Calibri" w:hAnsi="Calibri" w:cs="Calibri"/>
-          <w:i/>
-          <w:iCs/>
-        </w:rPr>
-        <w:t xml:space="preserve">Git y </w:t>
-      </w:r>
-      <w:r>
-        <w:rPr>
-          <w:rFonts w:ascii="Calibri" w:eastAsia="Calibri" w:hAnsi="Calibri" w:cs="Calibri"/>
-          <w:i/>
-          <w:iCs/>
-        </w:rPr>
-        <w:t>GitHub.</w:t>
+          <w:lang w:val="es-ES"/>
+        </w:rPr>
+      </w:pPr>
+      <w:r>
+        <w:rPr>
+          <w:rFonts w:ascii="Calibri" w:hAnsi="Calibri" w:cs="Calibri"/>
+          <w:i/>
+          <w:iCs/>
+          <w:lang w:val="es-ES"/>
+        </w:rPr>
+        <w:t>5</w:t>
+      </w:r>
+      <w:r>
+        <w:rPr>
+          <w:rFonts w:ascii="Calibri" w:hAnsi="Calibri" w:cs="Calibri"/>
+          <w:i/>
+          <w:iCs/>
+          <w:lang w:val="es-ES"/>
+        </w:rPr>
+        <w:t xml:space="preserve"> </w:t>
+      </w:r>
+      <w:r>
+        <w:rPr>
+          <w:rFonts w:ascii="Calibri" w:hAnsi="Calibri" w:cs="Calibri"/>
+          <w:i/>
+          <w:iCs/>
+          <w:lang w:val="es-ES"/>
+        </w:rPr>
+        <w:t>sistemas publicados</w:t>
+      </w:r>
+      <w:r>
+        <w:rPr>
+          <w:rFonts w:ascii="Calibri" w:hAnsi="Calibri" w:cs="Calibri"/>
+          <w:i/>
+          <w:iCs/>
+          <w:lang w:val="es-ES"/>
+        </w:rPr>
+        <w:t xml:space="preserve"> con demo</w:t>
+      </w:r>
+      <w:r>
+        <w:rPr>
+          <w:rFonts w:ascii="Calibri" w:hAnsi="Calibri" w:cs="Calibri"/>
+          <w:i/>
+          <w:iCs/>
+          <w:lang w:val="es-ES"/>
+        </w:rPr>
+        <w:t>, uno de ellos con instalador para Windows.</w:t>
       </w:r>
     </w:p>
     <w:p>
@@ -1321,7 +1583,7 @@
           <w:szCs w:val="22"/>
           <w:lang w:val="es-ES"/>
         </w:rPr>
-        <w:t xml:space="preserve"> </w:t>
+        <w:t xml:space="preserve"> RELEVANTES</w:t>
       </w:r>
     </w:p>
     <w:p>
@@ -1525,23 +1787,7 @@
           <w:i/>
           <w:iCs/>
         </w:rPr>
-        <w:t>: Angular, Node.js</w:t>
-      </w:r>
-      <w:r>
-        <w:rPr>
-          <w:rFonts w:ascii="Calibri" w:eastAsia="Calibri" w:hAnsi="Calibri" w:cs="Calibri"/>
-          <w:i/>
-          <w:iCs/>
-        </w:rPr>
-        <w:t>, MySQL</w:t>
-      </w:r>
-      <w:r>
-        <w:rPr>
-          <w:rFonts w:ascii="Calibri" w:eastAsia="Calibri" w:hAnsi="Calibri" w:cs="Calibri"/>
-          <w:i/>
-          <w:iCs/>
-        </w:rPr>
-        <w:t>.</w:t>
+        <w:t>: Angular, Node.js, MySQL.</w:t>
       </w:r>
     </w:p>
     <w:p>
@@ -1655,39 +1901,6 @@
     </w:p>
     <w:p>
       <w:pPr>
-        <w:tabs>
-          <w:tab w:val="right" w:pos="9360"/>
-        </w:tabs>
-        <w:spacing w:before="240" w:line="276" w:lineRule="auto"/>
-        <w:jc w:val="both"/>
-        <w:rPr>
-          <w:lang w:val="es-ES"/>
-        </w:rPr>
-      </w:pPr>
-      <w:r>
-        <w:rPr>
-          <w:rFonts w:ascii="Calibri" w:eastAsia="Calibri" w:hAnsi="Calibri" w:cs="Calibri"/>
-          <w:b/>
-          <w:bCs/>
-          <w:sz w:val="21"/>
-          <w:szCs w:val="21"/>
-          <w:lang w:val="es-ES"/>
-        </w:rPr>
-        <w:t>Asignador Heurístico de Redes Logísticas</w:t>
-      </w:r>
-      <w:r>
-        <w:rPr>
-          <w:rFonts w:ascii="Calibri" w:eastAsia="Calibri" w:hAnsi="Calibri" w:cs="Calibri"/>
-          <w:i/>
-          <w:iCs/>
-          <w:lang w:val="es-ES"/>
-        </w:rPr>
-        <w:tab/>
-        <w:t>2026</w:t>
-      </w:r>
-    </w:p>
-    <w:p>
-      <w:pPr>
         <w:pStyle w:val="Prrafodelista"/>
         <w:numPr>
           <w:ilvl w:val="0"/>
@@ -1704,183 +1917,343 @@
       </w:pPr>
       <w:r>
         <w:rPr>
-          <w:rFonts w:ascii="Calibri" w:eastAsia="Calibri" w:hAnsi="Calibri" w:cs="Calibri"/>
-          <w:i/>
-          <w:iCs/>
-          <w:lang w:val="es-ES"/>
-        </w:rPr>
-        <w:t xml:space="preserve">Sistema web para optimizar la asignación almacén–zona sobre un mapa real, utilizando distancias por calle y respaldo automático ante fallos del servicio de rutas. Implementé algoritmos de optimización con </w:t>
-      </w:r>
-      <w:proofErr w:type="spellStart"/>
-      <w:r>
-        <w:rPr>
-          <w:rFonts w:ascii="Calibri" w:eastAsia="Calibri" w:hAnsi="Calibri" w:cs="Calibri"/>
-          <w:i/>
-          <w:iCs/>
-          <w:lang w:val="es-ES"/>
-        </w:rPr>
-        <w:t>KPIs</w:t>
-      </w:r>
-      <w:proofErr w:type="spellEnd"/>
-      <w:r>
-        <w:rPr>
-          <w:rFonts w:ascii="Calibri" w:eastAsia="Calibri" w:hAnsi="Calibri" w:cs="Calibri"/>
-          <w:i/>
-          <w:iCs/>
-          <w:lang w:val="es-ES"/>
-        </w:rPr>
-        <w:t xml:space="preserve"> de costo, distancia y utilización</w:t>
-      </w:r>
-      <w:r>
-        <w:rPr>
-          <w:rFonts w:ascii="Calibri" w:eastAsia="Calibri" w:hAnsi="Calibri" w:cs="Calibri"/>
-          <w:i/>
-          <w:iCs/>
-          <w:lang w:val="es-ES"/>
-        </w:rPr>
-        <w:t>.</w:t>
-      </w:r>
-    </w:p>
-    <w:p>
-      <w:pPr>
-        <w:pStyle w:val="Prrafodelista"/>
-        <w:numPr>
-          <w:ilvl w:val="0"/>
-          <w:numId w:val="4"/>
-        </w:numPr>
-        <w:spacing w:line="276" w:lineRule="auto"/>
-        <w:jc w:val="both"/>
-        <w:rPr>
-          <w:rFonts w:ascii="Calibri" w:hAnsi="Calibri" w:cs="Calibri"/>
-          <w:i/>
-          <w:iCs/>
-          <w:lang w:val="es-ES"/>
-        </w:rPr>
-      </w:pPr>
-      <w:r>
-        <w:rPr>
-          <w:rFonts w:ascii="Calibri" w:eastAsia="Calibri" w:hAnsi="Calibri" w:cs="Calibri"/>
-          <w:b/>
-          <w:bCs/>
-          <w:i/>
-          <w:iCs/>
-          <w:lang w:val="es-ES"/>
-        </w:rPr>
-        <w:t>Stack</w:t>
-      </w:r>
-      <w:r>
-        <w:rPr>
-          <w:rFonts w:ascii="Calibri" w:eastAsia="Calibri" w:hAnsi="Calibri" w:cs="Calibri"/>
-          <w:i/>
-          <w:iCs/>
-          <w:lang w:val="es-ES"/>
-        </w:rPr>
-        <w:t xml:space="preserve">: </w:t>
-      </w:r>
-      <w:r>
-        <w:rPr>
-          <w:rFonts w:ascii="Calibri" w:eastAsia="Calibri" w:hAnsi="Calibri" w:cs="Calibri"/>
-          <w:i/>
-          <w:iCs/>
-          <w:lang w:val="es-ES"/>
-        </w:rPr>
-        <w:t>JavaScript, HTML</w:t>
-      </w:r>
-      <w:r>
-        <w:rPr>
-          <w:rFonts w:ascii="Calibri" w:eastAsia="Calibri" w:hAnsi="Calibri" w:cs="Calibri"/>
-          <w:i/>
-          <w:iCs/>
-          <w:lang w:val="es-ES"/>
-        </w:rPr>
-        <w:t xml:space="preserve">, </w:t>
-      </w:r>
-      <w:r>
-        <w:rPr>
-          <w:rFonts w:ascii="Calibri" w:eastAsia="Calibri" w:hAnsi="Calibri" w:cs="Calibri"/>
-          <w:i/>
-          <w:iCs/>
-          <w:lang w:val="es-ES"/>
-        </w:rPr>
-        <w:t>CSS, persistencia en JSON</w:t>
-      </w:r>
-      <w:r>
-        <w:rPr>
-          <w:rFonts w:ascii="Calibri" w:eastAsia="Calibri" w:hAnsi="Calibri" w:cs="Calibri"/>
-          <w:i/>
-          <w:iCs/>
-          <w:lang w:val="es-ES"/>
-        </w:rPr>
-        <w:t>.</w:t>
-      </w:r>
-    </w:p>
-    <w:p>
-      <w:pPr>
-        <w:pStyle w:val="Prrafodelista"/>
-        <w:numPr>
-          <w:ilvl w:val="0"/>
-          <w:numId w:val="4"/>
-        </w:numPr>
-        <w:spacing w:line="276" w:lineRule="auto"/>
-        <w:jc w:val="both"/>
-        <w:rPr>
-          <w:rFonts w:ascii="Calibri" w:hAnsi="Calibri" w:cs="Calibri"/>
-          <w:i/>
-          <w:iCs/>
-          <w:lang w:val="es-ES"/>
-        </w:rPr>
-      </w:pPr>
-      <w:r>
-        <w:rPr>
-          <w:rFonts w:ascii="Calibri" w:hAnsi="Calibri" w:cs="Calibri"/>
-          <w:b/>
-          <w:bCs/>
-          <w:i/>
-          <w:iCs/>
-          <w:lang w:val="es-ES"/>
-        </w:rPr>
-        <w:t>Código</w:t>
-      </w:r>
-      <w:r>
-        <w:rPr>
-          <w:rFonts w:ascii="Calibri" w:hAnsi="Calibri" w:cs="Calibri"/>
-          <w:i/>
-          <w:iCs/>
-          <w:lang w:val="es-ES"/>
-        </w:rPr>
-        <w:t xml:space="preserve">: </w:t>
+          <w:rFonts w:ascii="Calibri" w:hAnsi="Calibri" w:cs="Calibri"/>
+          <w:b/>
+          <w:bCs/>
+          <w:i/>
+          <w:iCs/>
+          <w:lang w:val="es-ES"/>
+        </w:rPr>
+        <w:t>Más proyectos en:</w:t>
+      </w:r>
+      <w:r>
+        <w:rPr>
+          <w:rFonts w:ascii="Calibri" w:hAnsi="Calibri" w:cs="Calibri"/>
+          <w:i/>
+          <w:iCs/>
+          <w:lang w:val="es-ES"/>
+        </w:rPr>
+        <w:t xml:space="preserve"> </w:t>
       </w:r>
       <w:hyperlink r:id="rId10" w:history="1">
         <w:r>
           <w:rPr>
             <w:rStyle w:val="Hipervnculo"/>
-            <w:rFonts w:ascii="Calibri" w:hAnsi="Calibri" w:cs="Calibri"/>
+            <w:rFonts w:ascii="Calibri" w:eastAsia="Calibri" w:hAnsi="Calibri" w:cs="Calibri"/>
             <w:i/>
             <w:iCs/>
             <w:lang w:val="es-ES"/>
           </w:rPr>
-          <w:t>GitHub</w:t>
+          <w:t>Portafolio</w:t>
         </w:r>
       </w:hyperlink>
-      <w:r>
-        <w:rPr>
-          <w:rFonts w:ascii="Calibri" w:hAnsi="Calibri" w:cs="Calibri"/>
-          <w:i/>
-          <w:iCs/>
-          <w:lang w:val="es-ES"/>
-        </w:rPr>
-        <w:t xml:space="preserve"> | </w:t>
-      </w:r>
-      <w:r>
-        <w:rPr>
-          <w:rFonts w:ascii="Calibri" w:eastAsia="Calibri" w:hAnsi="Calibri" w:cs="Calibri"/>
-          <w:b/>
-          <w:bCs/>
-          <w:i/>
-          <w:iCs/>
-          <w:lang w:val="es-ES"/>
-        </w:rPr>
-        <w:t>Demo en vivo</w:t>
+    </w:p>
+    <w:p>
+      <w:pPr>
+        <w:spacing w:line="276" w:lineRule="auto"/>
+        <w:jc w:val="both"/>
+        <w:rPr>
+          <w:rFonts w:ascii="Calibri" w:hAnsi="Calibri" w:cs="Calibri"/>
+          <w:i/>
+          <w:iCs/>
+          <w:lang w:val="es-ES"/>
+        </w:rPr>
+      </w:pPr>
+    </w:p>
+    <w:p>
+      <w:pPr>
+        <w:spacing w:line="276" w:lineRule="auto"/>
+        <w:jc w:val="both"/>
+        <w:rPr>
+          <w:rFonts w:ascii="Calibri" w:hAnsi="Calibri" w:cs="Calibri"/>
+          <w:i/>
+          <w:iCs/>
+          <w:lang w:val="es-ES"/>
+        </w:rPr>
+      </w:pPr>
+    </w:p>
+    <w:p>
+      <w:pPr>
+        <w:pBdr>
+          <w:bottom w:val="single" w:sz="6" w:space="4" w:color="1F4E79"/>
+        </w:pBdr>
+        <w:spacing w:before="240" w:line="276" w:lineRule="auto"/>
+        <w:jc w:val="both"/>
+        <w:rPr>
+          <w:lang w:val="es-ES"/>
+        </w:rPr>
+      </w:pPr>
+      <w:r>
+        <w:rPr>
+          <w:rFonts w:ascii="Calibri" w:eastAsia="Calibri" w:hAnsi="Calibri" w:cs="Calibri"/>
+          <w:b/>
+          <w:bCs/>
+          <w:color w:val="1F4E79"/>
+          <w:sz w:val="22"/>
+          <w:szCs w:val="22"/>
+          <w:lang w:val="es-ES"/>
+        </w:rPr>
+        <w:lastRenderedPageBreak/>
+        <w:t>FORMACIÓN ACADÉMICA</w:t>
+      </w:r>
+    </w:p>
+    <w:p>
+      <w:pPr>
+        <w:tabs>
+          <w:tab w:val="right" w:pos="9360"/>
+        </w:tabs>
+        <w:spacing w:line="276" w:lineRule="auto"/>
+        <w:jc w:val="both"/>
+        <w:rPr>
+          <w:lang w:val="es-ES"/>
+        </w:rPr>
+      </w:pPr>
+      <w:r>
+        <w:rPr>
+          <w:rFonts w:ascii="Calibri" w:eastAsia="Calibri" w:hAnsi="Calibri" w:cs="Calibri"/>
+          <w:b/>
+          <w:bCs/>
+          <w:sz w:val="21"/>
+          <w:szCs w:val="21"/>
+          <w:lang w:val="es-ES"/>
+        </w:rPr>
+        <w:t>Ingeniería de Sistemas</w:t>
+      </w:r>
+      <w:r>
+        <w:rPr>
+          <w:rFonts w:ascii="Calibri" w:eastAsia="Calibri" w:hAnsi="Calibri" w:cs="Calibri"/>
+          <w:i/>
+          <w:iCs/>
+          <w:lang w:val="es-ES"/>
+        </w:rPr>
+        <w:tab/>
+        <w:t>2022 – Actualidad</w:t>
+      </w:r>
+    </w:p>
+    <w:p>
+      <w:pPr>
+        <w:spacing w:line="276" w:lineRule="auto"/>
+        <w:jc w:val="both"/>
+        <w:rPr>
+          <w:rFonts w:ascii="Calibri" w:eastAsia="Calibri" w:hAnsi="Calibri" w:cs="Calibri"/>
+          <w:i/>
+          <w:iCs/>
+          <w:lang w:val="es-ES"/>
+        </w:rPr>
+      </w:pPr>
+      <w:r>
+        <w:rPr>
+          <w:rFonts w:ascii="Calibri" w:eastAsia="Calibri" w:hAnsi="Calibri" w:cs="Calibri"/>
+          <w:i/>
+          <w:iCs/>
+          <w:lang w:val="es-ES"/>
+        </w:rPr>
+        <w:t>Universidad Nacional de Ucayali — Pucallpa, Perú</w:t>
+      </w:r>
+    </w:p>
+    <w:p>
+      <w:pPr>
+        <w:pBdr>
+          <w:bottom w:val="single" w:sz="6" w:space="4" w:color="1F4E79"/>
+        </w:pBdr>
+        <w:spacing w:before="240" w:line="276" w:lineRule="auto"/>
+        <w:jc w:val="both"/>
+        <w:rPr>
+          <w:lang w:val="es-ES"/>
+        </w:rPr>
+      </w:pPr>
+      <w:r>
+        <w:rPr>
+          <w:rFonts w:ascii="Calibri" w:eastAsia="Calibri" w:hAnsi="Calibri" w:cs="Calibri"/>
+          <w:b/>
+          <w:bCs/>
+          <w:color w:val="1F4E79"/>
+          <w:sz w:val="22"/>
+          <w:szCs w:val="22"/>
+          <w:lang w:val="es-ES"/>
+        </w:rPr>
+        <w:t>CERTIFICACIONES</w:t>
+      </w:r>
+      <w:r>
+        <w:rPr>
+          <w:rFonts w:ascii="Calibri" w:eastAsia="Calibri" w:hAnsi="Calibri" w:cs="Calibri"/>
+          <w:b/>
+          <w:bCs/>
+          <w:color w:val="1F4E79"/>
+          <w:sz w:val="22"/>
+          <w:szCs w:val="22"/>
+          <w:lang w:val="es-ES"/>
+        </w:rPr>
+        <w:t>,</w:t>
+      </w:r>
+      <w:r>
+        <w:rPr>
+          <w:rFonts w:ascii="Calibri" w:eastAsia="Calibri" w:hAnsi="Calibri" w:cs="Calibri"/>
+          <w:b/>
+          <w:bCs/>
+          <w:color w:val="1F4E79"/>
+          <w:sz w:val="22"/>
+          <w:szCs w:val="22"/>
+          <w:lang w:val="es-ES"/>
+        </w:rPr>
+        <w:t xml:space="preserve"> CURSOS</w:t>
+      </w:r>
+      <w:r>
+        <w:rPr>
+          <w:rFonts w:ascii="Calibri" w:eastAsia="Calibri" w:hAnsi="Calibri" w:cs="Calibri"/>
+          <w:b/>
+          <w:bCs/>
+          <w:color w:val="1F4E79"/>
+          <w:sz w:val="22"/>
+          <w:szCs w:val="22"/>
+          <w:lang w:val="es-ES"/>
+        </w:rPr>
+        <w:t xml:space="preserve"> Y EVENTOS</w:t>
+      </w:r>
+    </w:p>
+    <w:p>
+      <w:pPr>
+        <w:tabs>
+          <w:tab w:val="right" w:pos="9360"/>
+        </w:tabs>
+        <w:spacing w:line="276" w:lineRule="auto"/>
+        <w:jc w:val="both"/>
+        <w:rPr>
+          <w:rFonts w:ascii="Calibri" w:eastAsia="Calibri" w:hAnsi="Calibri" w:cs="Calibri"/>
+          <w:b/>
+          <w:bCs/>
+          <w:sz w:val="21"/>
+          <w:szCs w:val="21"/>
+          <w:lang w:val="es-ES"/>
+        </w:rPr>
+      </w:pPr>
+      <w:proofErr w:type="spellStart"/>
+      <w:r>
+        <w:rPr>
+          <w:rFonts w:ascii="Calibri" w:eastAsia="Calibri" w:hAnsi="Calibri" w:cs="Calibri"/>
+          <w:b/>
+          <w:bCs/>
+          <w:sz w:val="21"/>
+          <w:szCs w:val="21"/>
+          <w:lang w:val="es-ES"/>
+        </w:rPr>
+        <w:t>TodoCode</w:t>
+      </w:r>
+      <w:proofErr w:type="spellEnd"/>
+      <w:r>
+        <w:rPr>
+          <w:rFonts w:ascii="Calibri" w:eastAsia="Calibri" w:hAnsi="Calibri" w:cs="Calibri"/>
+          <w:b/>
+          <w:bCs/>
+          <w:sz w:val="21"/>
+          <w:szCs w:val="21"/>
+          <w:lang w:val="es-ES"/>
+        </w:rPr>
+        <w:t xml:space="preserve"> — Introducción a las Bases de Datos Relacionales (con MySQL)</w:t>
+      </w:r>
+      <w:r>
+        <w:rPr>
+          <w:rFonts w:ascii="Calibri" w:eastAsia="Calibri" w:hAnsi="Calibri" w:cs="Calibri"/>
+          <w:i/>
+          <w:iCs/>
+          <w:lang w:val="es-ES"/>
+        </w:rPr>
+        <w:tab/>
+      </w:r>
+      <w:r>
+        <w:rPr>
+          <w:rFonts w:ascii="Calibri" w:eastAsia="Calibri" w:hAnsi="Calibri" w:cs="Calibri"/>
+          <w:i/>
+          <w:iCs/>
+          <w:lang w:val="es-ES"/>
+        </w:rPr>
+        <w:t>10</w:t>
+      </w:r>
+      <w:r>
+        <w:rPr>
+          <w:rFonts w:ascii="Calibri" w:eastAsia="Calibri" w:hAnsi="Calibri" w:cs="Calibri"/>
+          <w:i/>
+          <w:iCs/>
+          <w:lang w:val="es-ES"/>
+        </w:rPr>
+        <w:t>/202</w:t>
+      </w:r>
+      <w:r>
+        <w:rPr>
+          <w:rFonts w:ascii="Calibri" w:eastAsia="Calibri" w:hAnsi="Calibri" w:cs="Calibri"/>
+          <w:i/>
+          <w:iCs/>
+          <w:lang w:val="es-ES"/>
+        </w:rPr>
+        <w:t>6</w:t>
+      </w:r>
+      <w:r>
+        <w:rPr>
+          <w:rFonts w:ascii="Calibri" w:eastAsia="Calibri" w:hAnsi="Calibri" w:cs="Calibri"/>
+          <w:b/>
+          <w:bCs/>
+          <w:sz w:val="21"/>
+          <w:szCs w:val="21"/>
+          <w:lang w:val="es-ES"/>
+        </w:rPr>
+        <w:tab/>
+      </w:r>
+    </w:p>
+    <w:p>
+      <w:pPr>
+        <w:pStyle w:val="Prrafodelista"/>
+        <w:numPr>
+          <w:ilvl w:val="0"/>
+          <w:numId w:val="2"/>
+        </w:numPr>
+        <w:spacing w:line="276" w:lineRule="auto"/>
+        <w:jc w:val="both"/>
+        <w:rPr>
+          <w:lang w:val="es-ES"/>
+        </w:rPr>
+      </w:pPr>
+      <w:r>
+        <w:rPr>
+          <w:rFonts w:ascii="Calibri" w:eastAsia="Calibri" w:hAnsi="Calibri" w:cs="Calibri"/>
+          <w:i/>
+          <w:iCs/>
+          <w:lang w:val="es-ES"/>
+        </w:rPr>
+        <w:t>Fundamentos de bases de datos relacionales y consultas SQL con MySQL</w:t>
+      </w:r>
+      <w:r>
+        <w:rPr>
+          <w:rFonts w:ascii="Calibri" w:eastAsia="Calibri" w:hAnsi="Calibri" w:cs="Calibri"/>
+          <w:i/>
+          <w:iCs/>
+          <w:lang w:val="es-ES"/>
+        </w:rPr>
+        <w:t xml:space="preserve">. </w:t>
+      </w:r>
+    </w:p>
+    <w:p>
+      <w:pPr>
+        <w:pStyle w:val="Prrafodelista"/>
+        <w:numPr>
+          <w:ilvl w:val="0"/>
+          <w:numId w:val="2"/>
+        </w:numPr>
+        <w:spacing w:line="276" w:lineRule="auto"/>
+        <w:jc w:val="both"/>
+        <w:rPr>
+          <w:lang w:val="es-ES"/>
+        </w:rPr>
+      </w:pPr>
+      <w:r>
+        <w:rPr>
+          <w:rFonts w:ascii="Calibri" w:eastAsia="Calibri" w:hAnsi="Calibri" w:cs="Calibri"/>
+          <w:b/>
+          <w:bCs/>
+          <w:i/>
+          <w:iCs/>
+          <w:lang w:val="es-ES"/>
+        </w:rPr>
+        <w:t>Certificado</w:t>
       </w:r>
       <w:r>
         <w:rPr>
@@ -1900,7 +2273,7 @@
             <w:iCs/>
             <w:lang w:val="es-ES"/>
           </w:rPr>
-          <w:t>Ver Aplicación</w:t>
+          <w:t>Ver certificado</w:t>
         </w:r>
       </w:hyperlink>
     </w:p>
@@ -1929,7 +2302,6 @@
           <w:lang w:val="es-ES"/>
         </w:rPr>
       </w:pPr>
-      <w:proofErr w:type="spellStart"/>
       <w:r>
         <w:rPr>
           <w:rFonts w:ascii="Calibri" w:eastAsia="Calibri" w:hAnsi="Calibri" w:cs="Calibri"/>
@@ -1939,9 +2311,8 @@
           <w:szCs w:val="21"/>
           <w:lang w:val="es-ES"/>
         </w:rPr>
-        <w:t>RotaStock</w:t>
-      </w:r>
-      <w:proofErr w:type="spellEnd"/>
+        <w:t xml:space="preserve">CONEIMERA (Congreso Nacional de Estudiantes de Ing. </w:t>
+      </w:r>
       <w:r>
         <w:rPr>
           <w:rFonts w:ascii="Calibri" w:eastAsia="Calibri" w:hAnsi="Calibri" w:cs="Calibri"/>
@@ -1951,7 +2322,7 @@
           <w:szCs w:val="21"/>
           <w:lang w:val="es-ES"/>
         </w:rPr>
-        <w:t xml:space="preserve"> Plus — Control de Inventario</w:t>
+        <w:t>Mecánica-Eléctrica y Ramas Afines)</w:t>
       </w:r>
       <w:r>
         <w:rPr>
@@ -1961,225 +2332,7 @@
           <w:lang w:val="es-ES"/>
         </w:rPr>
         <w:tab/>
-        <w:t>2026</w:t>
-      </w:r>
-    </w:p>
-    <w:p>
-      <w:pPr>
-        <w:pStyle w:val="Prrafodelista"/>
-        <w:numPr>
-          <w:ilvl w:val="0"/>
-          <w:numId w:val="4"/>
-        </w:numPr>
-        <w:spacing w:line="276" w:lineRule="auto"/>
-        <w:jc w:val="both"/>
-        <w:rPr>
-          <w:rFonts w:ascii="Calibri" w:hAnsi="Calibri" w:cs="Calibri"/>
-          <w:i/>
-          <w:iCs/>
-          <w:lang w:val="es-ES"/>
-        </w:rPr>
-      </w:pPr>
-      <w:r>
-        <w:rPr>
-          <w:rFonts w:ascii="Calibri" w:eastAsia="Calibri" w:hAnsi="Calibri" w:cs="Calibri"/>
-          <w:i/>
-          <w:iCs/>
-          <w:lang w:val="es-ES"/>
-        </w:rPr>
-        <w:lastRenderedPageBreak/>
-        <w:t>Aplicación de escritorio offline para gestionar el ciclo completo del almacén, con FIFO, semaforización de rotación, clasificación ABC/XYZ, plan de compras, conteos auditables e informes en PDF y Excel. Diseñé e implementé la lógica de negocio y persistencia con copias de seguridad automáticas</w:t>
-      </w:r>
-      <w:r>
-        <w:rPr>
-          <w:rFonts w:ascii="Calibri" w:eastAsia="Calibri" w:hAnsi="Calibri" w:cs="Calibri"/>
-          <w:i/>
-          <w:iCs/>
-          <w:lang w:val="es-ES"/>
-        </w:rPr>
-        <w:t>.</w:t>
-      </w:r>
-    </w:p>
-    <w:p>
-      <w:pPr>
-        <w:pStyle w:val="Prrafodelista"/>
-        <w:numPr>
-          <w:ilvl w:val="0"/>
-          <w:numId w:val="4"/>
-        </w:numPr>
-        <w:spacing w:line="276" w:lineRule="auto"/>
-        <w:jc w:val="both"/>
-        <w:rPr>
-          <w:rFonts w:ascii="Calibri" w:hAnsi="Calibri" w:cs="Calibri"/>
-          <w:i/>
-          <w:iCs/>
-          <w:lang w:val="es-ES"/>
-        </w:rPr>
-      </w:pPr>
-      <w:r>
-        <w:rPr>
-          <w:rFonts w:ascii="Calibri" w:eastAsia="Calibri" w:hAnsi="Calibri" w:cs="Calibri"/>
-          <w:b/>
-          <w:bCs/>
-          <w:i/>
-          <w:iCs/>
-          <w:lang w:val="es-ES"/>
-        </w:rPr>
-        <w:t>Stack</w:t>
-      </w:r>
-      <w:r>
-        <w:rPr>
-          <w:rFonts w:ascii="Calibri" w:eastAsia="Calibri" w:hAnsi="Calibri" w:cs="Calibri"/>
-          <w:i/>
-          <w:iCs/>
-          <w:lang w:val="es-ES"/>
-        </w:rPr>
-        <w:t xml:space="preserve">: </w:t>
-      </w:r>
-      <w:r>
-        <w:rPr>
-          <w:rFonts w:ascii="Calibri" w:eastAsia="Calibri" w:hAnsi="Calibri" w:cs="Calibri"/>
-          <w:i/>
-          <w:iCs/>
-          <w:lang w:val="es-ES"/>
-        </w:rPr>
-        <w:t xml:space="preserve">JavaScript, </w:t>
-      </w:r>
-      <w:proofErr w:type="spellStart"/>
-      <w:r>
-        <w:rPr>
-          <w:rFonts w:ascii="Calibri" w:eastAsia="Calibri" w:hAnsi="Calibri" w:cs="Calibri"/>
-          <w:i/>
-          <w:iCs/>
-          <w:lang w:val="es-ES"/>
-        </w:rPr>
-        <w:t>Electron</w:t>
-      </w:r>
-      <w:proofErr w:type="spellEnd"/>
-      <w:r>
-        <w:rPr>
-          <w:rFonts w:ascii="Calibri" w:eastAsia="Calibri" w:hAnsi="Calibri" w:cs="Calibri"/>
-          <w:i/>
-          <w:iCs/>
-          <w:lang w:val="es-ES"/>
-        </w:rPr>
-        <w:t>, persistencia JSON</w:t>
-      </w:r>
-      <w:r>
-        <w:rPr>
-          <w:rFonts w:ascii="Calibri" w:eastAsia="Calibri" w:hAnsi="Calibri" w:cs="Calibri"/>
-          <w:i/>
-          <w:iCs/>
-          <w:lang w:val="es-ES"/>
-        </w:rPr>
-        <w:t>.</w:t>
-      </w:r>
-    </w:p>
-    <w:p>
-      <w:pPr>
-        <w:pStyle w:val="Prrafodelista"/>
-        <w:numPr>
-          <w:ilvl w:val="0"/>
-          <w:numId w:val="4"/>
-        </w:numPr>
-        <w:spacing w:line="276" w:lineRule="auto"/>
-        <w:jc w:val="both"/>
-        <w:rPr>
-          <w:rFonts w:ascii="Calibri" w:hAnsi="Calibri" w:cs="Calibri"/>
-          <w:i/>
-          <w:iCs/>
-          <w:lang w:val="es-ES"/>
-        </w:rPr>
-      </w:pPr>
-      <w:r>
-        <w:rPr>
-          <w:rFonts w:ascii="Calibri" w:eastAsia="Calibri" w:hAnsi="Calibri" w:cs="Calibri"/>
-          <w:b/>
-          <w:bCs/>
-          <w:i/>
-          <w:iCs/>
-          <w:lang w:val="es-ES"/>
-        </w:rPr>
-        <w:t>Código</w:t>
-      </w:r>
-      <w:r>
-        <w:rPr>
-          <w:rFonts w:ascii="Calibri" w:eastAsia="Calibri" w:hAnsi="Calibri" w:cs="Calibri"/>
-          <w:i/>
-          <w:iCs/>
-          <w:lang w:val="es-ES"/>
-        </w:rPr>
-        <w:t xml:space="preserve">: </w:t>
-      </w:r>
-      <w:hyperlink r:id="rId12" w:history="1">
-        <w:r>
-          <w:rPr>
-            <w:rStyle w:val="Hipervnculo"/>
-            <w:rFonts w:ascii="Calibri" w:eastAsia="Calibri" w:hAnsi="Calibri" w:cs="Calibri"/>
-            <w:i/>
-            <w:iCs/>
-            <w:lang w:val="es-ES"/>
-          </w:rPr>
-          <w:t>GitHub</w:t>
-        </w:r>
-      </w:hyperlink>
-      <w:r>
-        <w:rPr>
-          <w:rFonts w:ascii="Calibri" w:hAnsi="Calibri" w:cs="Calibri"/>
-          <w:i/>
-          <w:iCs/>
-          <w:lang w:val="es-ES"/>
-        </w:rPr>
-        <w:t xml:space="preserve"> | Instalador: </w:t>
-      </w:r>
-      <w:hyperlink r:id="rId13" w:history="1">
-        <w:r>
-          <w:rPr>
-            <w:rStyle w:val="Hipervnculo"/>
-            <w:rFonts w:ascii="Calibri" w:hAnsi="Calibri" w:cs="Calibri"/>
-            <w:i/>
-            <w:iCs/>
-            <w:lang w:val="es-ES"/>
-          </w:rPr>
-          <w:t>Instalador</w:t>
-        </w:r>
-      </w:hyperlink>
-    </w:p>
-    <w:p>
-      <w:pPr>
-        <w:pBdr>
-          <w:bottom w:val="single" w:sz="6" w:space="4" w:color="1F4E79"/>
-        </w:pBdr>
-        <w:spacing w:before="240" w:line="276" w:lineRule="auto"/>
-        <w:jc w:val="both"/>
-        <w:rPr>
-          <w:lang w:val="es-ES"/>
-        </w:rPr>
-      </w:pPr>
-      <w:r>
-        <w:rPr>
-          <w:rFonts w:ascii="Calibri" w:eastAsia="Calibri" w:hAnsi="Calibri" w:cs="Calibri"/>
-          <w:b/>
-          <w:bCs/>
-          <w:color w:val="1F4E79"/>
-          <w:sz w:val="22"/>
-          <w:szCs w:val="22"/>
-          <w:lang w:val="es-ES"/>
-        </w:rPr>
-        <w:t>EDUCACIÓN</w:t>
-      </w:r>
-    </w:p>
-    <w:p>
-      <w:pPr>
-        <w:tabs>
-          <w:tab w:val="right" w:pos="9360"/>
-        </w:tabs>
-        <w:spacing w:line="276" w:lineRule="auto"/>
-        <w:jc w:val="both"/>
-        <w:rPr>
-          <w:lang w:val="es-ES"/>
-        </w:rPr>
-      </w:pPr>
+      </w:r>
       <w:r>
         <w:rPr>
           <w:rFonts w:ascii="Calibri" w:eastAsia="Calibri" w:hAnsi="Calibri" w:cs="Calibri"/>
@@ -2189,159 +2342,7 @@
           <w:szCs w:val="21"/>
           <w:lang w:val="es-ES"/>
         </w:rPr>
-        <w:t>Ingeniería de Sistemas</w:t>
-      </w:r>
-      <w:r>
-        <w:rPr>
-          <w:rFonts w:ascii="Calibri" w:eastAsia="Calibri" w:hAnsi="Calibri" w:cs="Calibri"/>
-          <w:i/>
-          <w:iCs/>
-          <w:lang w:val="es-ES"/>
-        </w:rPr>
         <w:tab/>
-        <w:t>2022 – Actualidad (Ciclo X)</w:t>
-      </w:r>
-    </w:p>
-    <w:p>
-      <w:pPr>
-        <w:spacing w:line="276" w:lineRule="auto"/>
-        <w:jc w:val="both"/>
-        <w:rPr>
-          <w:lang w:val="es-ES"/>
-        </w:rPr>
-      </w:pPr>
-      <w:r>
-        <w:rPr>
-          <w:rFonts w:ascii="Calibri" w:eastAsia="Calibri" w:hAnsi="Calibri" w:cs="Calibri"/>
-          <w:i/>
-          <w:iCs/>
-          <w:lang w:val="es-ES"/>
-        </w:rPr>
-        <w:t>Universidad Nacional de Ucayali — Pucallpa, Perú</w:t>
-      </w:r>
-    </w:p>
-    <w:p>
-      <w:pPr>
-        <w:spacing w:line="276" w:lineRule="auto"/>
-        <w:jc w:val="both"/>
-        <w:rPr>
-          <w:lang w:val="es-ES"/>
-        </w:rPr>
-      </w:pPr>
-    </w:p>
-    <w:p>
-      <w:pPr>
-        <w:pBdr>
-          <w:bottom w:val="single" w:sz="6" w:space="4" w:color="1F4E79"/>
-        </w:pBdr>
-        <w:spacing w:before="240" w:line="276" w:lineRule="auto"/>
-        <w:jc w:val="both"/>
-        <w:rPr>
-          <w:lang w:val="es-ES"/>
-        </w:rPr>
-      </w:pPr>
-      <w:r>
-        <w:rPr>
-          <w:rFonts w:ascii="Calibri" w:eastAsia="Calibri" w:hAnsi="Calibri" w:cs="Calibri"/>
-          <w:b/>
-          <w:bCs/>
-          <w:color w:val="1F4E79"/>
-          <w:sz w:val="22"/>
-          <w:szCs w:val="22"/>
-          <w:lang w:val="es-ES"/>
-        </w:rPr>
-        <w:t xml:space="preserve">CERTIFICACIONES </w:t>
-      </w:r>
-      <w:r>
-        <w:rPr>
-          <w:rFonts w:ascii="Calibri" w:eastAsia="Calibri" w:hAnsi="Calibri" w:cs="Calibri"/>
-          <w:b/>
-          <w:bCs/>
-          <w:color w:val="1F4E79"/>
-          <w:sz w:val="22"/>
-          <w:szCs w:val="22"/>
-          <w:lang w:val="es-ES"/>
-        </w:rPr>
-        <w:t>Y PARTICIPACIÓN EN EVENTOS</w:t>
-      </w:r>
-    </w:p>
-    <w:p>
-      <w:pPr>
-        <w:tabs>
-          <w:tab w:val="right" w:pos="9360"/>
-        </w:tabs>
-        <w:spacing w:line="276" w:lineRule="auto"/>
-        <w:jc w:val="both"/>
-        <w:rPr>
-          <w:lang w:val="es-ES"/>
-        </w:rPr>
-      </w:pPr>
-      <w:r>
-        <w:rPr>
-          <w:rFonts w:ascii="Calibri" w:eastAsia="Calibri" w:hAnsi="Calibri" w:cs="Calibri"/>
-          <w:b/>
-          <w:bCs/>
-          <w:sz w:val="21"/>
-          <w:szCs w:val="21"/>
-          <w:lang w:val="es-ES"/>
-        </w:rPr>
-        <w:t xml:space="preserve">CONEIMERA (Congreso Nacional de Estudiantes de Ing. </w:t>
-      </w:r>
-      <w:r>
-        <w:rPr>
-          <w:rFonts w:ascii="Calibri" w:eastAsia="Calibri" w:hAnsi="Calibri" w:cs="Calibri"/>
-          <w:b/>
-          <w:bCs/>
-          <w:sz w:val="21"/>
-          <w:szCs w:val="21"/>
-          <w:lang w:val="es-ES"/>
-        </w:rPr>
-        <w:t>Mecánica-Eléctrica y Ramas Afines)</w:t>
-      </w:r>
-      <w:r>
-        <w:rPr>
-          <w:rFonts w:ascii="Calibri" w:eastAsia="Calibri" w:hAnsi="Calibri" w:cs="Calibri"/>
-          <w:i/>
-          <w:iCs/>
-          <w:lang w:val="es-ES"/>
-        </w:rPr>
-        <w:tab/>
-      </w:r>
-      <w:r>
-        <w:rPr>
-          <w:rFonts w:ascii="Calibri" w:eastAsia="Calibri" w:hAnsi="Calibri" w:cs="Calibri"/>
-          <w:i/>
-          <w:iCs/>
-          <w:lang w:val="es-ES"/>
-        </w:rPr>
-        <w:t xml:space="preserve">                    </w:t>
-      </w:r>
-      <w:r>
-        <w:rPr>
-          <w:rFonts w:ascii="Calibri" w:eastAsia="Calibri" w:hAnsi="Calibri" w:cs="Calibri"/>
-          <w:i/>
-          <w:iCs/>
-          <w:lang w:val="es-ES"/>
-        </w:rPr>
-        <w:t>08/2025</w:t>
-      </w:r>
-      <w:r>
-        <w:rPr>
-          <w:rFonts w:ascii="Calibri" w:eastAsia="Calibri" w:hAnsi="Calibri" w:cs="Calibri"/>
-          <w:i/>
-          <w:iCs/>
-          <w:lang w:val="es-ES"/>
-        </w:rPr>
-        <w:t xml:space="preserve"> y 10</w:t>
-      </w:r>
-      <w:r>
-        <w:rPr>
-          <w:rFonts w:ascii="Calibri" w:eastAsia="Calibri" w:hAnsi="Calibri" w:cs="Calibri"/>
-          <w:i/>
-          <w:iCs/>
-          <w:lang w:val="es-ES"/>
-        </w:rPr>
-        <w:t>/2024</w:t>
       </w:r>
     </w:p>
     <w:p>
@@ -2354,94 +2355,17 @@
         <w:spacing w:line="276" w:lineRule="auto"/>
         <w:jc w:val="both"/>
         <w:rPr>
-          <w:i/>
-          <w:iCs/>
-          <w:lang w:val="es-ES"/>
-        </w:rPr>
-      </w:pPr>
-      <w:r>
-        <w:rPr>
-          <w:rFonts w:ascii="Calibri" w:eastAsia="Calibri" w:hAnsi="Calibri" w:cs="Calibri"/>
-          <w:b/>
-          <w:bCs/>
-          <w:i/>
-          <w:iCs/>
-          <w:lang w:val="es-ES"/>
-        </w:rPr>
-        <w:t>1</w:t>
-      </w:r>
-      <w:r>
-        <w:rPr>
-          <w:rFonts w:ascii="Calibri" w:eastAsia="Calibri" w:hAnsi="Calibri" w:cs="Calibri"/>
-          <w:b/>
-          <w:bCs/>
-          <w:i/>
-          <w:iCs/>
-          <w:lang w:val="es-ES"/>
-        </w:rPr>
-        <w:t>er Puesto en Concurso de Programación Competitiva (</w:t>
-      </w:r>
-      <w:r>
-        <w:rPr>
-          <w:rFonts w:ascii="Calibri" w:eastAsia="Calibri" w:hAnsi="Calibri" w:cs="Calibri"/>
-          <w:b/>
-          <w:bCs/>
-          <w:i/>
-          <w:iCs/>
-          <w:lang w:val="es-ES"/>
-        </w:rPr>
-        <w:t xml:space="preserve">UNTELS – Universidad Nacional Tecnológica de </w:t>
-      </w:r>
-      <w:r>
-        <w:rPr>
-          <w:rFonts w:ascii="Calibri" w:eastAsia="Calibri" w:hAnsi="Calibri" w:cs="Calibri"/>
-          <w:b/>
-          <w:bCs/>
-          <w:i/>
-          <w:iCs/>
-          <w:lang w:val="es-ES"/>
-        </w:rPr>
-        <w:t>Lima</w:t>
-      </w:r>
-      <w:r>
-        <w:rPr>
-          <w:rFonts w:ascii="Calibri" w:eastAsia="Calibri" w:hAnsi="Calibri" w:cs="Calibri"/>
-          <w:b/>
-          <w:bCs/>
-          <w:i/>
-          <w:iCs/>
-          <w:lang w:val="es-ES"/>
-        </w:rPr>
-        <w:t xml:space="preserve"> Sur</w:t>
-      </w:r>
-      <w:r>
-        <w:rPr>
-          <w:rFonts w:ascii="Calibri" w:eastAsia="Calibri" w:hAnsi="Calibri" w:cs="Calibri"/>
-          <w:b/>
-          <w:bCs/>
-          <w:i/>
-          <w:iCs/>
-          <w:lang w:val="es-ES"/>
-        </w:rPr>
-        <w:t xml:space="preserve">, 2024): </w:t>
-      </w:r>
-      <w:r>
-        <w:rPr>
-          <w:rFonts w:ascii="Calibri" w:eastAsia="Calibri" w:hAnsi="Calibri" w:cs="Calibri"/>
-          <w:i/>
-          <w:iCs/>
-          <w:lang w:val="es-ES"/>
-        </w:rPr>
-        <w:t>Resolución de problemas algorítmicos complejos y optimización de código bajo presión (equipo de 3 integrantes)</w:t>
-      </w:r>
-      <w:r>
-        <w:rPr>
-          <w:rFonts w:ascii="Calibri" w:hAnsi="Calibri" w:cs="Calibri"/>
-          <w:i/>
-          <w:iCs/>
-          <w:lang w:val="es-ES"/>
-        </w:rPr>
-        <w:t>.</w:t>
+          <w:lang w:val="es-ES"/>
+        </w:rPr>
+      </w:pPr>
+      <w:r>
+        <w:rPr>
+          <w:rFonts w:ascii="Calibri" w:eastAsia="Calibri" w:hAnsi="Calibri" w:cs="Calibri"/>
+          <w:i/>
+          <w:iCs/>
+          <w:lang w:val="es-ES"/>
+        </w:rPr>
+        <w:t xml:space="preserve">CONEIMERA 2025, Universidad Nacional de Trujillo – 08/2025. </w:t>
       </w:r>
     </w:p>
     <w:p>
@@ -2460,48 +2384,209 @@
       <w:r>
         <w:rPr>
           <w:rFonts w:ascii="Calibri" w:eastAsia="Calibri" w:hAnsi="Calibri" w:cs="Calibri"/>
-          <w:b/>
-          <w:bCs/>
-          <w:i/>
-          <w:iCs/>
-          <w:lang w:val="es-ES"/>
-        </w:rPr>
-        <w:t>Participación Académica (</w:t>
-      </w:r>
-      <w:r>
-        <w:rPr>
-          <w:rFonts w:ascii="Calibri" w:eastAsia="Calibri" w:hAnsi="Calibri" w:cs="Calibri"/>
-          <w:b/>
-          <w:bCs/>
-          <w:i/>
-          <w:iCs/>
-          <w:lang w:val="es-ES"/>
-        </w:rPr>
-        <w:t xml:space="preserve">UNT – Universidad Nacional de </w:t>
-      </w:r>
-      <w:r>
-        <w:rPr>
-          <w:rFonts w:ascii="Calibri" w:eastAsia="Calibri" w:hAnsi="Calibri" w:cs="Calibri"/>
-          <w:b/>
-          <w:bCs/>
-          <w:i/>
-          <w:iCs/>
-          <w:lang w:val="es-ES"/>
-        </w:rPr>
-        <w:t>Trujillo, 2025):</w:t>
-      </w:r>
-      <w:r>
-        <w:rPr>
-          <w:rFonts w:ascii="Calibri" w:eastAsia="Calibri" w:hAnsi="Calibri" w:cs="Calibri"/>
-          <w:i/>
-          <w:iCs/>
-          <w:lang w:val="es-ES"/>
-        </w:rPr>
-        <w:t xml:space="preserve"> Actualización en innovación tecnológica, arquitecturas modernas y tendencias en ingeniería</w:t>
-      </w:r>
-      <w:r>
-        <w:rPr>
-          <w:rFonts w:ascii="Calibri" w:eastAsia="Calibri" w:hAnsi="Calibri" w:cs="Calibri"/>
+          <w:i/>
+          <w:iCs/>
+          <w:lang w:val="es-ES"/>
+        </w:rPr>
+        <w:t xml:space="preserve">CONEIMERA 2024, Universidad Nacional Tecnológica de Lima Sur – </w:t>
+      </w:r>
+      <w:r>
+        <w:rPr>
+          <w:rFonts w:ascii="Calibri" w:eastAsia="Calibri" w:hAnsi="Calibri" w:cs="Calibri"/>
+          <w:i/>
+          <w:iCs/>
+          <w:lang w:val="es-ES"/>
+        </w:rPr>
+        <w:t>09/2024.</w:t>
+      </w:r>
+    </w:p>
+    <w:p>
+      <w:pPr>
+        <w:pBdr>
+          <w:bottom w:val="single" w:sz="6" w:space="4" w:color="1F4E79"/>
+        </w:pBdr>
+        <w:spacing w:before="240" w:line="276" w:lineRule="auto"/>
+        <w:jc w:val="both"/>
+        <w:rPr>
+          <w:lang w:val="es-ES"/>
+        </w:rPr>
+      </w:pPr>
+      <w:r>
+        <w:rPr>
+          <w:rFonts w:ascii="Calibri" w:eastAsia="Calibri" w:hAnsi="Calibri" w:cs="Calibri"/>
+          <w:b/>
+          <w:bCs/>
+          <w:color w:val="1F4E79"/>
+          <w:sz w:val="22"/>
+          <w:szCs w:val="22"/>
+          <w:lang w:val="es-ES"/>
+        </w:rPr>
+        <w:t>RECONOCIMIENTOS</w:t>
+      </w:r>
+    </w:p>
+    <w:p>
+      <w:pPr>
+        <w:tabs>
+          <w:tab w:val="right" w:pos="9360"/>
+        </w:tabs>
+        <w:spacing w:line="276" w:lineRule="auto"/>
+        <w:jc w:val="both"/>
+        <w:rPr>
+          <w:lang w:val="es-ES"/>
+        </w:rPr>
+      </w:pPr>
+      <w:r>
+        <w:rPr>
+          <w:rFonts w:ascii="Calibri" w:eastAsia="Calibri" w:hAnsi="Calibri" w:cs="Calibri"/>
+          <w:b/>
+          <w:bCs/>
+          <w:sz w:val="21"/>
+          <w:szCs w:val="21"/>
+          <w:lang w:val="es-ES"/>
+        </w:rPr>
+        <w:t xml:space="preserve">CONEIMERA (Congreso Nacional de Estudiantes de Ing. </w:t>
+      </w:r>
+      <w:r>
+        <w:rPr>
+          <w:rFonts w:ascii="Calibri" w:eastAsia="Calibri" w:hAnsi="Calibri" w:cs="Calibri"/>
+          <w:b/>
+          <w:bCs/>
+          <w:sz w:val="21"/>
+          <w:szCs w:val="21"/>
+          <w:lang w:val="es-ES"/>
+        </w:rPr>
+        <w:t>Mecánica-Eléctrica y Ramas Afines)</w:t>
+      </w:r>
+      <w:r>
+        <w:rPr>
+          <w:rFonts w:ascii="Calibri" w:eastAsia="Calibri" w:hAnsi="Calibri" w:cs="Calibri"/>
+          <w:i/>
+          <w:iCs/>
+          <w:lang w:val="es-ES"/>
+        </w:rPr>
+        <w:tab/>
+      </w:r>
+      <w:r>
+        <w:rPr>
+          <w:rFonts w:ascii="Calibri" w:eastAsia="Calibri" w:hAnsi="Calibri" w:cs="Calibri"/>
+          <w:i/>
+          <w:iCs/>
+          <w:lang w:val="es-ES"/>
+        </w:rPr>
+        <w:t xml:space="preserve">            0</w:t>
+      </w:r>
+      <w:r>
+        <w:rPr>
+          <w:rFonts w:ascii="Calibri" w:eastAsia="Calibri" w:hAnsi="Calibri" w:cs="Calibri"/>
+          <w:i/>
+          <w:iCs/>
+          <w:lang w:val="es-ES"/>
+        </w:rPr>
+        <w:t>9</w:t>
+      </w:r>
+      <w:r>
+        <w:rPr>
+          <w:rFonts w:ascii="Calibri" w:eastAsia="Calibri" w:hAnsi="Calibri" w:cs="Calibri"/>
+          <w:i/>
+          <w:iCs/>
+          <w:lang w:val="es-ES"/>
+        </w:rPr>
+        <w:t>/2024</w:t>
+      </w:r>
+    </w:p>
+    <w:p>
+      <w:pPr>
+        <w:pStyle w:val="Prrafodelista"/>
+        <w:numPr>
+          <w:ilvl w:val="0"/>
+          <w:numId w:val="2"/>
+        </w:numPr>
+        <w:spacing w:line="276" w:lineRule="auto"/>
+        <w:jc w:val="both"/>
+        <w:rPr>
+          <w:i/>
+          <w:iCs/>
+          <w:lang w:val="es-ES"/>
+        </w:rPr>
+      </w:pPr>
+      <w:r>
+        <w:rPr>
+          <w:rFonts w:ascii="Calibri" w:eastAsia="Calibri" w:hAnsi="Calibri" w:cs="Calibri"/>
+          <w:b/>
+          <w:bCs/>
+          <w:i/>
+          <w:iCs/>
+          <w:lang w:val="es-ES"/>
+        </w:rPr>
+        <w:t>1</w:t>
+      </w:r>
+      <w:r>
+        <w:rPr>
+          <w:rFonts w:ascii="Calibri" w:eastAsia="Calibri" w:hAnsi="Calibri" w:cs="Calibri"/>
+          <w:b/>
+          <w:bCs/>
+          <w:i/>
+          <w:iCs/>
+          <w:lang w:val="es-ES"/>
+        </w:rPr>
+        <w:t>er Puesto en Concurso de Programación Competitiva (</w:t>
+      </w:r>
+      <w:r>
+        <w:rPr>
+          <w:rFonts w:ascii="Calibri" w:eastAsia="Calibri" w:hAnsi="Calibri" w:cs="Calibri"/>
+          <w:b/>
+          <w:bCs/>
+          <w:i/>
+          <w:iCs/>
+          <w:lang w:val="es-ES"/>
+        </w:rPr>
+        <w:t xml:space="preserve">UNTELS – Universidad Nacional Tecnológica de </w:t>
+      </w:r>
+      <w:r>
+        <w:rPr>
+          <w:rFonts w:ascii="Calibri" w:eastAsia="Calibri" w:hAnsi="Calibri" w:cs="Calibri"/>
+          <w:b/>
+          <w:bCs/>
+          <w:i/>
+          <w:iCs/>
+          <w:lang w:val="es-ES"/>
+        </w:rPr>
+        <w:t>Lima</w:t>
+      </w:r>
+      <w:r>
+        <w:rPr>
+          <w:rFonts w:ascii="Calibri" w:eastAsia="Calibri" w:hAnsi="Calibri" w:cs="Calibri"/>
+          <w:b/>
+          <w:bCs/>
+          <w:i/>
+          <w:iCs/>
+          <w:lang w:val="es-ES"/>
+        </w:rPr>
+        <w:t xml:space="preserve"> Sur</w:t>
+      </w:r>
+      <w:r>
+        <w:rPr>
+          <w:rFonts w:ascii="Calibri" w:eastAsia="Calibri" w:hAnsi="Calibri" w:cs="Calibri"/>
+          <w:b/>
+          <w:bCs/>
+          <w:i/>
+          <w:iCs/>
+          <w:lang w:val="es-ES"/>
+        </w:rPr>
+        <w:t xml:space="preserve">, 2024): </w:t>
+      </w:r>
+      <w:r>
+        <w:rPr>
+          <w:rFonts w:ascii="Calibri" w:eastAsia="Calibri" w:hAnsi="Calibri" w:cs="Calibri"/>
+          <w:i/>
+          <w:iCs/>
+          <w:lang w:val="es-ES"/>
+        </w:rPr>
+        <w:t>Resolución de problemas algorítmicos complejos y optimización de código bajo presión (equipo de 3 integrantes)</w:t>
+      </w:r>
+      <w:r>
+        <w:rPr>
+          <w:rFonts w:ascii="Calibri" w:hAnsi="Calibri" w:cs="Calibri"/>
           <w:i/>
           <w:iCs/>
           <w:lang w:val="es-ES"/>
@@ -2511,13 +2596,166 @@
     </w:p>
     <w:p>
       <w:pPr>
-        <w:spacing w:line="276" w:lineRule="auto"/>
-        <w:jc w:val="both"/>
-        <w:rPr>
-          <w:color w:val="747474" w:themeColor="background2" w:themeShade="80"/>
-          <w:lang w:val="es-ES"/>
-        </w:rPr>
-      </w:pPr>
+        <w:pBdr>
+          <w:bottom w:val="single" w:sz="6" w:space="4" w:color="1F4E79"/>
+        </w:pBdr>
+        <w:spacing w:before="240" w:line="276" w:lineRule="auto"/>
+        <w:jc w:val="both"/>
+        <w:rPr>
+          <w:lang w:val="es-ES"/>
+        </w:rPr>
+      </w:pPr>
+      <w:r>
+        <w:rPr>
+          <w:rFonts w:ascii="Calibri" w:eastAsia="Calibri" w:hAnsi="Calibri" w:cs="Calibri"/>
+          <w:b/>
+          <w:bCs/>
+          <w:color w:val="1F4E79"/>
+          <w:sz w:val="22"/>
+          <w:szCs w:val="22"/>
+          <w:lang w:val="es-ES"/>
+        </w:rPr>
+        <w:t>REFERENC</w:t>
+      </w:r>
+      <w:r>
+        <w:rPr>
+          <w:rFonts w:ascii="Calibri" w:eastAsia="Calibri" w:hAnsi="Calibri" w:cs="Calibri"/>
+          <w:b/>
+          <w:bCs/>
+          <w:color w:val="1F4E79"/>
+          <w:sz w:val="22"/>
+          <w:szCs w:val="22"/>
+          <w:lang w:val="es-ES"/>
+        </w:rPr>
+        <w:t>IAS</w:t>
+      </w:r>
+      <w:r>
+        <w:rPr>
+          <w:rFonts w:ascii="Calibri" w:eastAsia="Calibri" w:hAnsi="Calibri" w:cs="Calibri"/>
+          <w:b/>
+          <w:bCs/>
+          <w:color w:val="1F4E79"/>
+          <w:sz w:val="22"/>
+          <w:szCs w:val="22"/>
+          <w:lang w:val="es-ES"/>
+        </w:rPr>
+        <w:t xml:space="preserve"> PERSONAL</w:t>
+      </w:r>
+      <w:r>
+        <w:rPr>
+          <w:rFonts w:ascii="Calibri" w:eastAsia="Calibri" w:hAnsi="Calibri" w:cs="Calibri"/>
+          <w:b/>
+          <w:bCs/>
+          <w:color w:val="1F4E79"/>
+          <w:sz w:val="22"/>
+          <w:szCs w:val="22"/>
+          <w:lang w:val="es-ES"/>
+        </w:rPr>
+        <w:t>ES</w:t>
+      </w:r>
+    </w:p>
+    <w:p>
+      <w:pPr>
+        <w:tabs>
+          <w:tab w:val="right" w:pos="9360"/>
+        </w:tabs>
+        <w:spacing w:line="276" w:lineRule="auto"/>
+        <w:jc w:val="both"/>
+        <w:rPr>
+          <w:rFonts w:ascii="Calibri" w:eastAsia="Calibri" w:hAnsi="Calibri" w:cs="Calibri"/>
+          <w:b/>
+          <w:bCs/>
+          <w:sz w:val="21"/>
+          <w:szCs w:val="21"/>
+          <w:lang w:val="es-ES"/>
+        </w:rPr>
+      </w:pPr>
+      <w:r>
+        <w:rPr>
+          <w:rFonts w:ascii="Calibri" w:eastAsia="Calibri" w:hAnsi="Calibri" w:cs="Calibri"/>
+          <w:b/>
+          <w:bCs/>
+          <w:sz w:val="21"/>
+          <w:szCs w:val="21"/>
+          <w:lang w:val="es-ES"/>
+        </w:rPr>
+        <w:t xml:space="preserve">Paolo Blancas </w:t>
+      </w:r>
+      <w:r>
+        <w:rPr>
+          <w:rFonts w:ascii="Calibri" w:eastAsia="Calibri" w:hAnsi="Calibri" w:cs="Calibri"/>
+          <w:sz w:val="21"/>
+          <w:szCs w:val="21"/>
+          <w:lang w:val="es-ES"/>
+        </w:rPr>
+        <w:t xml:space="preserve">– </w:t>
+      </w:r>
+      <w:r>
+        <w:rPr>
+          <w:rFonts w:ascii="Calibri" w:eastAsia="Calibri" w:hAnsi="Calibri" w:cs="Calibri"/>
+          <w:sz w:val="21"/>
+          <w:szCs w:val="21"/>
+          <w:lang w:val="es-ES"/>
+        </w:rPr>
+        <w:t>Desarrollador</w:t>
+      </w:r>
+      <w:r>
+        <w:rPr>
+          <w:rFonts w:ascii="Calibri" w:eastAsia="Calibri" w:hAnsi="Calibri" w:cs="Calibri"/>
+          <w:sz w:val="21"/>
+          <w:szCs w:val="21"/>
+          <w:lang w:val="es-ES"/>
+        </w:rPr>
+        <w:t xml:space="preserve"> Freelance</w:t>
+      </w:r>
+      <w:r>
+        <w:rPr>
+          <w:rFonts w:ascii="Calibri" w:eastAsia="Calibri" w:hAnsi="Calibri" w:cs="Calibri"/>
+          <w:b/>
+          <w:bCs/>
+          <w:sz w:val="21"/>
+          <w:szCs w:val="21"/>
+          <w:lang w:val="es-ES"/>
+        </w:rPr>
+        <w:tab/>
+      </w:r>
+    </w:p>
+    <w:p>
+      <w:pPr>
+        <w:pStyle w:val="Prrafodelista"/>
+        <w:numPr>
+          <w:ilvl w:val="0"/>
+          <w:numId w:val="2"/>
+        </w:numPr>
+        <w:spacing w:line="276" w:lineRule="auto"/>
+        <w:jc w:val="both"/>
+        <w:rPr>
+          <w:rFonts w:ascii="Calibri" w:hAnsi="Calibri" w:cs="Calibri"/>
+          <w:lang w:val="es-ES"/>
+        </w:rPr>
+      </w:pPr>
+      <w:r>
+        <w:rPr>
+          <w:rFonts w:ascii="Calibri" w:eastAsia="Calibri" w:hAnsi="Calibri" w:cs="Calibri"/>
+          <w:b/>
+          <w:bCs/>
+          <w:i/>
+          <w:iCs/>
+          <w:lang w:val="es-ES"/>
+        </w:rPr>
+        <w:t xml:space="preserve">Correo: </w:t>
+      </w:r>
+      <w:r>
+        <w:rPr>
+          <w:rFonts w:ascii="Calibri" w:hAnsi="Calibri" w:cs="Calibri"/>
+          <w:i/>
+          <w:iCs/>
+          <w:color w:val="215E99" w:themeColor="text2" w:themeTint="BF"/>
+          <w:szCs w:val="18"/>
+          <w:lang w:val="es-PE"/>
+        </w:rPr>
+        <w:t>blancaspaolo101997@gmail.com</w:t>
+      </w:r>
     </w:p>
     <w:sectPr>
       <w:pgSz w:w="12240" w:h="15840"/>
@@ -3198,6 +3436,7 @@
   <w:style w:type="paragraph" w:default="1" w:styleId="Normal">
     <w:name w:val="Normal"/>
     <w:qFormat/>
+    <w:rsid w:val="004F0B4A"/>
   </w:style>
   <w:style w:type="paragraph" w:styleId="Ttulo1">
     <w:name w:val="heading 1"/>
@@ -3416,6 +3655,18 @@
     <w:rPr>
       <w:color w:val="96607D" w:themeColor="followedHyperlink"/>
       <w:u w:val="single"/>
+    </w:rPr>
+  </w:style>
+  <w:style w:type="paragraph" w:styleId="NormalWeb">
+    <w:name w:val="Normal (Web)"/>
+    <w:basedOn w:val="Normal"/>
+    <w:uiPriority w:val="99"/>
+    <w:semiHidden/>
+    <w:unhideWhenUsed/>
+    <w:rsid w:val="00082BBE"/>
+    <w:rPr>
+      <w:sz w:val="24"/>
+      <w:szCs w:val="24"/>
     </w:rPr>
   </w:style>
 </w:styles>

</xml_diff>